<commit_message>
fix: template fix with underlines, reduce all border radius, added PII columns but leave them blank
</commit_message>
<xml_diff>
--- a/backend/data/mau_so_03.docx
+++ b/backend/data/mau_so_03.docx
@@ -1,6 +1,6 @@
 
 <file path=word/document.xml><?xml version="1.0" encoding="utf-8"?>
-<w:document xmlns:wpc="http://schemas.microsoft.com/office/word/2010/wordprocessingCanvas" xmlns:cx="http://schemas.microsoft.com/office/drawing/2014/chartex" xmlns:cx1="http://schemas.microsoft.com/office/drawing/2015/9/8/chartex" xmlns:cx2="http://schemas.microsoft.com/office/drawing/2015/10/21/chartex" xmlns:cx3="http://schemas.microsoft.com/office/drawing/2016/5/9/chartex" xmlns:cx4="http://schemas.microsoft.com/office/drawing/2016/5/10/chartex" xmlns:cx5="http://schemas.microsoft.com/office/drawing/2016/5/11/chartex" xmlns:cx6="http://schemas.microsoft.com/office/drawing/2016/5/12/chartex" xmlns:cx7="http://schemas.microsoft.com/office/drawing/2016/5/13/chartex" xmlns:cx8="http://schemas.microsoft.com/office/drawing/2016/5/14/chartex" xmlns:mc="http://schemas.openxmlformats.org/markup-compatibility/2006" xmlns:aink="http://schemas.microsoft.com/office/drawing/2016/ink" xmlns:am3d="http://schemas.microsoft.com/office/drawing/2017/model3d" xmlns:o="urn:schemas-microsoft-com:office:office" xmlns:r="http://schemas.openxmlformats.org/officeDocument/2006/relationships" xmlns:m="http://schemas.openxmlformats.org/officeDocument/2006/math" xmlns:v="urn:schemas-microsoft-com:vml" xmlns:wp14="http://schemas.microsoft.com/office/word/2010/wordprocessingDrawing" xmlns:wp="http://schemas.openxmlformats.org/drawingml/2006/wordprocessingDrawing" xmlns:w10="urn:schemas-microsoft-com:office:word" xmlns:w="http://schemas.openxmlformats.org/wordprocessingml/2006/main" xmlns:w14="http://schemas.microsoft.com/office/word/2010/wordml" xmlns:w15="http://schemas.microsoft.com/office/word/2012/wordml" xmlns:w16cex="http://schemas.microsoft.com/office/word/2018/wordml/cex" xmlns:w16cid="http://schemas.microsoft.com/office/word/2016/wordml/cid" xmlns:w16="http://schemas.microsoft.com/office/word/2018/wordml" xmlns:w16sdtdh="http://schemas.microsoft.com/office/word/2020/wordml/sdtdatahash" xmlns:w16se="http://schemas.microsoft.com/office/word/2015/wordml/symex" xmlns:wpg="http://schemas.microsoft.com/office/word/2010/wordprocessingGroup" xmlns:wpi="http://schemas.microsoft.com/office/word/2010/wordprocessingInk" xmlns:wne="http://schemas.microsoft.com/office/word/2006/wordml" xmlns:wps="http://schemas.microsoft.com/office/word/2010/wordprocessingShape" mc:Ignorable="w14 w15 w16se w16cid w16 w16cex w16sdtdh wp14">
+<w:document xmlns:wpc="http://schemas.microsoft.com/office/word/2010/wordprocessingCanvas" xmlns:cx="http://schemas.microsoft.com/office/drawing/2014/chartex" xmlns:cx1="http://schemas.microsoft.com/office/drawing/2015/9/8/chartex" xmlns:cx2="http://schemas.microsoft.com/office/drawing/2015/10/21/chartex" xmlns:cx3="http://schemas.microsoft.com/office/drawing/2016/5/9/chartex" xmlns:cx4="http://schemas.microsoft.com/office/drawing/2016/5/10/chartex" xmlns:cx5="http://schemas.microsoft.com/office/drawing/2016/5/11/chartex" xmlns:cx6="http://schemas.microsoft.com/office/drawing/2016/5/12/chartex" xmlns:cx7="http://schemas.microsoft.com/office/drawing/2016/5/13/chartex" xmlns:cx8="http://schemas.microsoft.com/office/drawing/2016/5/14/chartex" xmlns:mc="http://schemas.openxmlformats.org/markup-compatibility/2006" xmlns:m="http://schemas.openxmlformats.org/officeDocument/2006/math" xmlns:aink="http://schemas.microsoft.com/office/drawing/2016/ink" xmlns:am3d="http://schemas.microsoft.com/office/drawing/2017/model3d" xmlns:oel="http://schemas.microsoft.com/office/2019/extlst" xmlns:r="http://schemas.openxmlformats.org/officeDocument/2006/relationships" xmlns:wp14="http://schemas.microsoft.com/office/word/2010/wordprocessingDrawing" xmlns:wp="http://schemas.openxmlformats.org/drawingml/2006/wordprocessingDrawing" xmlns:wpg="http://schemas.microsoft.com/office/word/2010/wordprocessingGroup" xmlns:wpi="http://schemas.microsoft.com/office/word/2010/wordprocessingInk" xmlns:wps="http://schemas.microsoft.com/office/word/2010/wordprocessingShape" xmlns:o="urn:schemas-microsoft-com:office:office" xmlns:v="urn:schemas-microsoft-com:vml" xmlns:w10="urn:schemas-microsoft-com:office:word" xmlns:w="http://schemas.openxmlformats.org/wordprocessingml/2006/main" xmlns:w14="http://schemas.microsoft.com/office/word/2010/wordml" xmlns:w15="http://schemas.microsoft.com/office/word/2012/wordml" xmlns:w16cex="http://schemas.microsoft.com/office/word/2018/wordml/cex" xmlns:w16cid="http://schemas.microsoft.com/office/word/2016/wordml/cid" xmlns:w16="http://schemas.microsoft.com/office/word/2018/wordml" xmlns:w16sdtdh="http://schemas.microsoft.com/office/word/2020/wordml/sdtdatahash" xmlns:w16sdtfl="http://schemas.microsoft.com/office/word/2024/wordml/sdtformatlock" xmlns:w16se="http://schemas.microsoft.com/office/word/2015/wordml/symex" xmlns:w16du="http://schemas.microsoft.com/office/word/2023/wordml/word16du" xmlns:wne="http://schemas.microsoft.com/office/word/2006/wordml" mc:Ignorable="w14 w15 w16se w16cid w16 w16cex w16sdtdh w16sdtfl w16du wp14">
   <w:body>
     <w:p>
       <w:pPr>
@@ -914,7 +914,6 @@
         </w:rPr>
         <w:t xml:space="preserve"> </w:t>
       </w:r>
-      <w:proofErr w:type="spellStart"/>
     </w:p>
     <w:p>
       <w:pPr>
@@ -924,21 +923,15 @@
           <w:szCs w:val="26"/>
         </w:rPr>
       </w:pPr>
-      <w:r>
-        <w:rPr>
-          <w:sz w:val="26"/>
-          <w:szCs w:val="26"/>
-        </w:rPr>
-        <w:t>Tuổ</w:t>
-      </w:r>
-      <w:proofErr w:type="spellEnd"/>
-      <w:r>
-        <w:rPr>
-          <w:sz w:val="26"/>
-          <w:szCs w:val="26"/>
-        </w:rPr>
-        <w:t>i</w:t>
-      </w:r>
+      <w:proofErr w:type="spellStart"/>
+      <w:r>
+        <w:rPr>
+          <w:sz w:val="26"/>
+          <w:szCs w:val="26"/>
+        </w:rPr>
+        <w:t>Tuổi</w:t>
+      </w:r>
+      <w:proofErr w:type="spellEnd"/>
       <w:r>
         <w:rPr>
           <w:sz w:val="26"/>
@@ -958,7 +951,23 @@
           <w:sz w:val="26"/>
           <w:szCs w:val="26"/>
         </w:rPr>
-        <w:t xml:space="preserve"> Giới </w:t>
+        <w:t xml:space="preserve"> </w:t>
+      </w:r>
+      <w:proofErr w:type="spellStart"/>
+      <w:r>
+        <w:rPr>
+          <w:sz w:val="26"/>
+          <w:szCs w:val="26"/>
+        </w:rPr>
+        <w:t>Giới</w:t>
+      </w:r>
+      <w:proofErr w:type="spellEnd"/>
+      <w:r>
+        <w:rPr>
+          <w:sz w:val="26"/>
+          <w:szCs w:val="26"/>
+        </w:rPr>
+        <w:t xml:space="preserve"> </w:t>
       </w:r>
       <w:proofErr w:type="spellStart"/>
       <w:r>
@@ -1511,7 +1520,6 @@
           <w:szCs w:val="26"/>
         </w:rPr>
       </w:pPr>
-      <w:proofErr w:type="spellStart"/>
       <w:r>
         <w:rPr>
           <w:b/>
@@ -1519,17 +1527,7 @@
           <w:sz w:val="26"/>
           <w:szCs w:val="26"/>
         </w:rPr>
-        <w:t>II. CH</w:t>
-      </w:r>
-      <w:proofErr w:type="spellEnd"/>
-      <w:r>
-        <w:rPr>
-          <w:b/>
-          <w:bCs/>
-          <w:sz w:val="26"/>
-          <w:szCs w:val="26"/>
-        </w:rPr>
-        <w:t xml:space="preserve">ẨN ĐOÁN </w:t>
+        <w:t xml:space="preserve">II. CHẨN ĐOÁN </w:t>
       </w:r>
       <w:r>
         <w:rPr>
@@ -1885,6 +1883,7 @@
         <w:rPr>
           <w:sz w:val="26"/>
           <w:szCs w:val="26"/>
+          <w:u w:val="single"/>
         </w:rPr>
         <w:t xml:space="preserve">Lý do </w:t>
       </w:r>
@@ -1893,6 +1892,7 @@
         <w:rPr>
           <w:sz w:val="26"/>
           <w:szCs w:val="26"/>
+          <w:u w:val="single"/>
         </w:rPr>
         <w:t>vào</w:t>
       </w:r>
@@ -1901,14 +1901,16 @@
         <w:rPr>
           <w:sz w:val="26"/>
           <w:szCs w:val="26"/>
-        </w:rPr>
-        <w:t xml:space="preserve"> </w:t>
-      </w:r>
-      <w:proofErr w:type="spellStart"/>
-      <w:r>
-        <w:rPr>
-          <w:sz w:val="26"/>
-          <w:szCs w:val="26"/>
+          <w:u w:val="single"/>
+        </w:rPr>
+        <w:t xml:space="preserve"> </w:t>
+      </w:r>
+      <w:proofErr w:type="spellStart"/>
+      <w:r>
+        <w:rPr>
+          <w:sz w:val="26"/>
+          <w:szCs w:val="26"/>
+          <w:u w:val="single"/>
         </w:rPr>
         <w:t>viện</w:t>
       </w:r>
@@ -1917,8 +1919,16 @@
         <w:rPr>
           <w:sz w:val="26"/>
           <w:szCs w:val="26"/>
-        </w:rPr>
-        <w:t>: {{</w:t>
+          <w:u w:val="single"/>
+        </w:rPr>
+        <w:t>:</w:t>
+      </w:r>
+      <w:r>
+        <w:rPr>
+          <w:sz w:val="26"/>
+          <w:szCs w:val="26"/>
+        </w:rPr>
+        <w:t xml:space="preserve"> {{</w:t>
       </w:r>
       <w:proofErr w:type="spellStart"/>
       <w:r>
@@ -1950,6 +1960,7 @@
         <w:rPr>
           <w:sz w:val="26"/>
           <w:szCs w:val="26"/>
+          <w:u w:val="single"/>
         </w:rPr>
         <w:t>Tóm</w:t>
       </w:r>
@@ -1958,14 +1969,16 @@
         <w:rPr>
           <w:sz w:val="26"/>
           <w:szCs w:val="26"/>
-        </w:rPr>
-        <w:t xml:space="preserve"> </w:t>
-      </w:r>
-      <w:proofErr w:type="spellStart"/>
-      <w:r>
-        <w:rPr>
-          <w:sz w:val="26"/>
-          <w:szCs w:val="26"/>
+          <w:u w:val="single"/>
+        </w:rPr>
+        <w:t xml:space="preserve"> </w:t>
+      </w:r>
+      <w:proofErr w:type="spellStart"/>
+      <w:r>
+        <w:rPr>
+          <w:sz w:val="26"/>
+          <w:szCs w:val="26"/>
+          <w:u w:val="single"/>
         </w:rPr>
         <w:t>tắt</w:t>
       </w:r>
@@ -1974,14 +1987,16 @@
         <w:rPr>
           <w:sz w:val="26"/>
           <w:szCs w:val="26"/>
-        </w:rPr>
-        <w:t xml:space="preserve"> </w:t>
-      </w:r>
-      <w:proofErr w:type="spellStart"/>
-      <w:r>
-        <w:rPr>
-          <w:sz w:val="26"/>
-          <w:szCs w:val="26"/>
+          <w:u w:val="single"/>
+        </w:rPr>
+        <w:t xml:space="preserve"> </w:t>
+      </w:r>
+      <w:proofErr w:type="spellStart"/>
+      <w:r>
+        <w:rPr>
+          <w:sz w:val="26"/>
+          <w:szCs w:val="26"/>
+          <w:u w:val="single"/>
         </w:rPr>
         <w:t>quá</w:t>
       </w:r>
@@ -1990,14 +2005,16 @@
         <w:rPr>
           <w:sz w:val="26"/>
           <w:szCs w:val="26"/>
-        </w:rPr>
-        <w:t xml:space="preserve"> </w:t>
-      </w:r>
-      <w:proofErr w:type="spellStart"/>
-      <w:r>
-        <w:rPr>
-          <w:sz w:val="26"/>
-          <w:szCs w:val="26"/>
+          <w:u w:val="single"/>
+        </w:rPr>
+        <w:t xml:space="preserve"> </w:t>
+      </w:r>
+      <w:proofErr w:type="spellStart"/>
+      <w:r>
+        <w:rPr>
+          <w:sz w:val="26"/>
+          <w:szCs w:val="26"/>
+          <w:u w:val="single"/>
         </w:rPr>
         <w:t>trình</w:t>
       </w:r>
@@ -2006,14 +2023,16 @@
         <w:rPr>
           <w:sz w:val="26"/>
           <w:szCs w:val="26"/>
-        </w:rPr>
-        <w:t xml:space="preserve"> </w:t>
-      </w:r>
-      <w:proofErr w:type="spellStart"/>
-      <w:r>
-        <w:rPr>
-          <w:sz w:val="26"/>
-          <w:szCs w:val="26"/>
+          <w:u w:val="single"/>
+        </w:rPr>
+        <w:t xml:space="preserve"> </w:t>
+      </w:r>
+      <w:proofErr w:type="spellStart"/>
+      <w:r>
+        <w:rPr>
+          <w:sz w:val="26"/>
+          <w:szCs w:val="26"/>
+          <w:u w:val="single"/>
         </w:rPr>
         <w:t>bệnh</w:t>
       </w:r>
@@ -2022,14 +2041,16 @@
         <w:rPr>
           <w:sz w:val="26"/>
           <w:szCs w:val="26"/>
-        </w:rPr>
-        <w:t xml:space="preserve"> </w:t>
-      </w:r>
-      <w:proofErr w:type="spellStart"/>
-      <w:r>
-        <w:rPr>
-          <w:sz w:val="26"/>
-          <w:szCs w:val="26"/>
+          <w:u w:val="single"/>
+        </w:rPr>
+        <w:t xml:space="preserve"> </w:t>
+      </w:r>
+      <w:proofErr w:type="spellStart"/>
+      <w:r>
+        <w:rPr>
+          <w:sz w:val="26"/>
+          <w:szCs w:val="26"/>
+          <w:u w:val="single"/>
         </w:rPr>
         <w:t>lý</w:t>
       </w:r>
@@ -2038,14 +2059,16 @@
         <w:rPr>
           <w:sz w:val="26"/>
           <w:szCs w:val="26"/>
-        </w:rPr>
-        <w:t xml:space="preserve"> </w:t>
-      </w:r>
-      <w:proofErr w:type="spellStart"/>
-      <w:r>
-        <w:rPr>
-          <w:sz w:val="26"/>
-          <w:szCs w:val="26"/>
+          <w:u w:val="single"/>
+        </w:rPr>
+        <w:t xml:space="preserve"> </w:t>
+      </w:r>
+      <w:proofErr w:type="spellStart"/>
+      <w:r>
+        <w:rPr>
+          <w:sz w:val="26"/>
+          <w:szCs w:val="26"/>
+          <w:u w:val="single"/>
         </w:rPr>
         <w:t>và</w:t>
       </w:r>
@@ -2054,14 +2077,16 @@
         <w:rPr>
           <w:sz w:val="26"/>
           <w:szCs w:val="26"/>
-        </w:rPr>
-        <w:t xml:space="preserve"> </w:t>
-      </w:r>
-      <w:proofErr w:type="spellStart"/>
-      <w:r>
-        <w:rPr>
-          <w:sz w:val="26"/>
-          <w:szCs w:val="26"/>
+          <w:u w:val="single"/>
+        </w:rPr>
+        <w:t xml:space="preserve"> </w:t>
+      </w:r>
+      <w:proofErr w:type="spellStart"/>
+      <w:r>
+        <w:rPr>
+          <w:sz w:val="26"/>
+          <w:szCs w:val="26"/>
+          <w:u w:val="single"/>
         </w:rPr>
         <w:t>diễn</w:t>
       </w:r>
@@ -2070,14 +2095,16 @@
         <w:rPr>
           <w:sz w:val="26"/>
           <w:szCs w:val="26"/>
-        </w:rPr>
-        <w:t xml:space="preserve"> </w:t>
-      </w:r>
-      <w:proofErr w:type="spellStart"/>
-      <w:r>
-        <w:rPr>
-          <w:sz w:val="26"/>
-          <w:szCs w:val="26"/>
+          <w:u w:val="single"/>
+        </w:rPr>
+        <w:t xml:space="preserve"> </w:t>
+      </w:r>
+      <w:proofErr w:type="spellStart"/>
+      <w:r>
+        <w:rPr>
+          <w:sz w:val="26"/>
+          <w:szCs w:val="26"/>
+          <w:u w:val="single"/>
         </w:rPr>
         <w:t>biến</w:t>
       </w:r>
@@ -2086,14 +2113,16 @@
         <w:rPr>
           <w:sz w:val="26"/>
           <w:szCs w:val="26"/>
-        </w:rPr>
-        <w:t xml:space="preserve"> </w:t>
-      </w:r>
-      <w:proofErr w:type="spellStart"/>
-      <w:r>
-        <w:rPr>
-          <w:sz w:val="26"/>
-          <w:szCs w:val="26"/>
+          <w:u w:val="single"/>
+        </w:rPr>
+        <w:t xml:space="preserve"> </w:t>
+      </w:r>
+      <w:proofErr w:type="spellStart"/>
+      <w:r>
+        <w:rPr>
+          <w:sz w:val="26"/>
+          <w:szCs w:val="26"/>
+          <w:u w:val="single"/>
         </w:rPr>
         <w:t>lâm</w:t>
       </w:r>
@@ -2102,14 +2131,16 @@
         <w:rPr>
           <w:sz w:val="26"/>
           <w:szCs w:val="26"/>
-        </w:rPr>
-        <w:t xml:space="preserve"> </w:t>
-      </w:r>
-      <w:proofErr w:type="spellStart"/>
-      <w:r>
-        <w:rPr>
-          <w:sz w:val="26"/>
-          <w:szCs w:val="26"/>
+          <w:u w:val="single"/>
+        </w:rPr>
+        <w:t xml:space="preserve"> </w:t>
+      </w:r>
+      <w:proofErr w:type="spellStart"/>
+      <w:r>
+        <w:rPr>
+          <w:sz w:val="26"/>
+          <w:szCs w:val="26"/>
+          <w:u w:val="single"/>
         </w:rPr>
         <w:t>sàng</w:t>
       </w:r>
@@ -2118,6 +2149,7 @@
         <w:rPr>
           <w:sz w:val="26"/>
           <w:szCs w:val="26"/>
+          <w:u w:val="single"/>
         </w:rPr>
         <w:t xml:space="preserve"> (</w:t>
       </w:r>
@@ -2126,6 +2158,7 @@
         <w:rPr>
           <w:sz w:val="26"/>
           <w:szCs w:val="26"/>
+          <w:u w:val="single"/>
         </w:rPr>
         <w:t>Đặc</w:t>
       </w:r>
@@ -2134,14 +2167,16 @@
         <w:rPr>
           <w:sz w:val="26"/>
           <w:szCs w:val="26"/>
-        </w:rPr>
-        <w:t xml:space="preserve"> </w:t>
-      </w:r>
-      <w:proofErr w:type="spellStart"/>
-      <w:r>
-        <w:rPr>
-          <w:sz w:val="26"/>
-          <w:szCs w:val="26"/>
+          <w:u w:val="single"/>
+        </w:rPr>
+        <w:t xml:space="preserve"> </w:t>
+      </w:r>
+      <w:proofErr w:type="spellStart"/>
+      <w:r>
+        <w:rPr>
+          <w:sz w:val="26"/>
+          <w:szCs w:val="26"/>
+          <w:u w:val="single"/>
         </w:rPr>
         <w:t>điểm</w:t>
       </w:r>
@@ -2150,14 +2185,16 @@
         <w:rPr>
           <w:sz w:val="26"/>
           <w:szCs w:val="26"/>
-        </w:rPr>
-        <w:t xml:space="preserve"> </w:t>
-      </w:r>
-      <w:proofErr w:type="spellStart"/>
-      <w:r>
-        <w:rPr>
-          <w:sz w:val="26"/>
-          <w:szCs w:val="26"/>
+          <w:u w:val="single"/>
+        </w:rPr>
+        <w:t xml:space="preserve"> </w:t>
+      </w:r>
+      <w:proofErr w:type="spellStart"/>
+      <w:r>
+        <w:rPr>
+          <w:sz w:val="26"/>
+          <w:szCs w:val="26"/>
+          <w:u w:val="single"/>
         </w:rPr>
         <w:t>khởi</w:t>
       </w:r>
@@ -2166,14 +2203,16 @@
         <w:rPr>
           <w:sz w:val="26"/>
           <w:szCs w:val="26"/>
-        </w:rPr>
-        <w:t xml:space="preserve"> </w:t>
-      </w:r>
-      <w:proofErr w:type="spellStart"/>
-      <w:r>
-        <w:rPr>
-          <w:sz w:val="26"/>
-          <w:szCs w:val="26"/>
+          <w:u w:val="single"/>
+        </w:rPr>
+        <w:t xml:space="preserve"> </w:t>
+      </w:r>
+      <w:proofErr w:type="spellStart"/>
+      <w:r>
+        <w:rPr>
+          <w:sz w:val="26"/>
+          <w:szCs w:val="26"/>
+          <w:u w:val="single"/>
         </w:rPr>
         <w:t>phát</w:t>
       </w:r>
@@ -2182,6 +2221,7 @@
         <w:rPr>
           <w:sz w:val="26"/>
           <w:szCs w:val="26"/>
+          <w:u w:val="single"/>
         </w:rPr>
         <w:t xml:space="preserve">, </w:t>
       </w:r>
@@ -2190,6 +2230,7 @@
         <w:rPr>
           <w:sz w:val="26"/>
           <w:szCs w:val="26"/>
+          <w:u w:val="single"/>
         </w:rPr>
         <w:t>các</w:t>
       </w:r>
@@ -2198,14 +2239,16 @@
         <w:rPr>
           <w:sz w:val="26"/>
           <w:szCs w:val="26"/>
-        </w:rPr>
-        <w:t xml:space="preserve"> </w:t>
-      </w:r>
-      <w:proofErr w:type="spellStart"/>
-      <w:r>
-        <w:rPr>
-          <w:sz w:val="26"/>
-          <w:szCs w:val="26"/>
+          <w:u w:val="single"/>
+        </w:rPr>
+        <w:t xml:space="preserve"> </w:t>
+      </w:r>
+      <w:proofErr w:type="spellStart"/>
+      <w:r>
+        <w:rPr>
+          <w:sz w:val="26"/>
+          <w:szCs w:val="26"/>
+          <w:u w:val="single"/>
         </w:rPr>
         <w:t>triệu</w:t>
       </w:r>
@@ -2214,14 +2257,16 @@
         <w:rPr>
           <w:sz w:val="26"/>
           <w:szCs w:val="26"/>
-        </w:rPr>
-        <w:t xml:space="preserve"> </w:t>
-      </w:r>
-      <w:proofErr w:type="spellStart"/>
-      <w:r>
-        <w:rPr>
-          <w:sz w:val="26"/>
-          <w:szCs w:val="26"/>
+          <w:u w:val="single"/>
+        </w:rPr>
+        <w:t xml:space="preserve"> </w:t>
+      </w:r>
+      <w:proofErr w:type="spellStart"/>
+      <w:r>
+        <w:rPr>
+          <w:sz w:val="26"/>
+          <w:szCs w:val="26"/>
+          <w:u w:val="single"/>
         </w:rPr>
         <w:t>chứng</w:t>
       </w:r>
@@ -2230,14 +2275,16 @@
         <w:rPr>
           <w:sz w:val="26"/>
           <w:szCs w:val="26"/>
-        </w:rPr>
-        <w:t xml:space="preserve"> </w:t>
-      </w:r>
-      <w:proofErr w:type="spellStart"/>
-      <w:r>
-        <w:rPr>
-          <w:sz w:val="26"/>
-          <w:szCs w:val="26"/>
+          <w:u w:val="single"/>
+        </w:rPr>
+        <w:t xml:space="preserve"> </w:t>
+      </w:r>
+      <w:proofErr w:type="spellStart"/>
+      <w:r>
+        <w:rPr>
+          <w:sz w:val="26"/>
+          <w:szCs w:val="26"/>
+          <w:u w:val="single"/>
         </w:rPr>
         <w:t>lâm</w:t>
       </w:r>
@@ -2246,14 +2293,16 @@
         <w:rPr>
           <w:sz w:val="26"/>
           <w:szCs w:val="26"/>
-        </w:rPr>
-        <w:t xml:space="preserve"> </w:t>
-      </w:r>
-      <w:proofErr w:type="spellStart"/>
-      <w:r>
-        <w:rPr>
-          <w:sz w:val="26"/>
-          <w:szCs w:val="26"/>
+          <w:u w:val="single"/>
+        </w:rPr>
+        <w:t xml:space="preserve"> </w:t>
+      </w:r>
+      <w:proofErr w:type="spellStart"/>
+      <w:r>
+        <w:rPr>
+          <w:sz w:val="26"/>
+          <w:szCs w:val="26"/>
+          <w:u w:val="single"/>
         </w:rPr>
         <w:t>sàng</w:t>
       </w:r>
@@ -2262,6 +2311,7 @@
         <w:rPr>
           <w:sz w:val="26"/>
           <w:szCs w:val="26"/>
+          <w:u w:val="single"/>
         </w:rPr>
         <w:t xml:space="preserve">, </w:t>
       </w:r>
@@ -2270,6 +2320,7 @@
         <w:rPr>
           <w:sz w:val="26"/>
           <w:szCs w:val="26"/>
+          <w:u w:val="single"/>
         </w:rPr>
         <w:t>diễn</w:t>
       </w:r>
@@ -2278,14 +2329,16 @@
         <w:rPr>
           <w:sz w:val="26"/>
           <w:szCs w:val="26"/>
-        </w:rPr>
-        <w:t xml:space="preserve"> </w:t>
-      </w:r>
-      <w:proofErr w:type="spellStart"/>
-      <w:r>
-        <w:rPr>
-          <w:sz w:val="26"/>
-          <w:szCs w:val="26"/>
+          <w:u w:val="single"/>
+        </w:rPr>
+        <w:t xml:space="preserve"> </w:t>
+      </w:r>
+      <w:proofErr w:type="spellStart"/>
+      <w:r>
+        <w:rPr>
+          <w:sz w:val="26"/>
+          <w:szCs w:val="26"/>
+          <w:u w:val="single"/>
         </w:rPr>
         <w:t>biến</w:t>
       </w:r>
@@ -2294,14 +2347,16 @@
         <w:rPr>
           <w:sz w:val="26"/>
           <w:szCs w:val="26"/>
-        </w:rPr>
-        <w:t xml:space="preserve"> </w:t>
-      </w:r>
-      <w:proofErr w:type="spellStart"/>
-      <w:r>
-        <w:rPr>
-          <w:sz w:val="26"/>
-          <w:szCs w:val="26"/>
+          <w:u w:val="single"/>
+        </w:rPr>
+        <w:t xml:space="preserve"> </w:t>
+      </w:r>
+      <w:proofErr w:type="spellStart"/>
+      <w:r>
+        <w:rPr>
+          <w:sz w:val="26"/>
+          <w:szCs w:val="26"/>
+          <w:u w:val="single"/>
         </w:rPr>
         <w:t>bệnh</w:t>
       </w:r>
@@ -2310,8 +2365,39 @@
         <w:rPr>
           <w:sz w:val="26"/>
           <w:szCs w:val="26"/>
+          <w:u w:val="single"/>
         </w:rPr>
         <w:t>...):</w:t>
+      </w:r>
+      <w:r>
+        <w:rPr>
+          <w:sz w:val="26"/>
+          <w:szCs w:val="26"/>
+        </w:rPr>
+        <w:t xml:space="preserve"> </w:t>
+      </w:r>
+      <w:r>
+        <w:rPr>
+          <w:sz w:val="26"/>
+          <w:szCs w:val="26"/>
+        </w:rPr>
+        <w:t>{{</w:t>
+      </w:r>
+      <w:proofErr w:type="spellStart"/>
+      <w:r>
+        <w:rPr>
+          <w:sz w:val="26"/>
+          <w:szCs w:val="26"/>
+        </w:rPr>
+        <w:t>tom_tat_qua_trinh_dien_bien</w:t>
+      </w:r>
+      <w:proofErr w:type="spellEnd"/>
+      <w:r>
+        <w:rPr>
+          <w:sz w:val="26"/>
+          <w:szCs w:val="26"/>
+        </w:rPr>
+        <w:t>}}</w:t>
       </w:r>
     </w:p>
     <w:p>
@@ -2322,6 +2408,67 @@
           <w:szCs w:val="26"/>
         </w:rPr>
       </w:pPr>
+      <w:proofErr w:type="spellStart"/>
+      <w:r>
+        <w:rPr>
+          <w:sz w:val="26"/>
+          <w:szCs w:val="26"/>
+          <w:u w:val="single"/>
+        </w:rPr>
+        <w:t>Tiền</w:t>
+      </w:r>
+      <w:proofErr w:type="spellEnd"/>
+      <w:r>
+        <w:rPr>
+          <w:sz w:val="26"/>
+          <w:szCs w:val="26"/>
+          <w:u w:val="single"/>
+        </w:rPr>
+        <w:t xml:space="preserve"> </w:t>
+      </w:r>
+      <w:proofErr w:type="spellStart"/>
+      <w:r>
+        <w:rPr>
+          <w:sz w:val="26"/>
+          <w:szCs w:val="26"/>
+          <w:u w:val="single"/>
+        </w:rPr>
+        <w:t>sử</w:t>
+      </w:r>
+      <w:proofErr w:type="spellEnd"/>
+      <w:r>
+        <w:rPr>
+          <w:sz w:val="26"/>
+          <w:szCs w:val="26"/>
+          <w:u w:val="single"/>
+        </w:rPr>
+        <w:t xml:space="preserve"> </w:t>
+      </w:r>
+      <w:proofErr w:type="spellStart"/>
+      <w:r>
+        <w:rPr>
+          <w:sz w:val="26"/>
+          <w:szCs w:val="26"/>
+          <w:u w:val="single"/>
+        </w:rPr>
+        <w:t>bệnh</w:t>
+      </w:r>
+      <w:proofErr w:type="spellEnd"/>
+      <w:r>
+        <w:rPr>
+          <w:sz w:val="26"/>
+          <w:szCs w:val="26"/>
+          <w:u w:val="single"/>
+        </w:rPr>
+        <w:t>:</w:t>
+      </w:r>
+      <w:r>
+        <w:rPr>
+          <w:sz w:val="26"/>
+          <w:szCs w:val="26"/>
+        </w:rPr>
+        <w:t xml:space="preserve"> </w:t>
+      </w:r>
       <w:r>
         <w:rPr>
           <w:sz w:val="26"/>
@@ -2335,7 +2482,7 @@
           <w:sz w:val="26"/>
           <w:szCs w:val="26"/>
         </w:rPr>
-        <w:t>tom_tat_qua_trinh_dien_bien</w:t>
+        <w:t>tien_su_benh</w:t>
       </w:r>
       <w:proofErr w:type="spellEnd"/>
       <w:r>
@@ -2359,48 +2506,373 @@
         <w:rPr>
           <w:sz w:val="26"/>
           <w:szCs w:val="26"/>
-        </w:rPr>
-        <w:t>Tiền</w:t>
-      </w:r>
-      <w:proofErr w:type="spellEnd"/>
-      <w:r>
-        <w:rPr>
-          <w:sz w:val="26"/>
-          <w:szCs w:val="26"/>
-        </w:rPr>
-        <w:t xml:space="preserve"> </w:t>
-      </w:r>
-      <w:proofErr w:type="spellStart"/>
-      <w:r>
-        <w:rPr>
-          <w:sz w:val="26"/>
-          <w:szCs w:val="26"/>
-        </w:rPr>
-        <w:t>sử</w:t>
-      </w:r>
-      <w:proofErr w:type="spellEnd"/>
-      <w:r>
-        <w:rPr>
-          <w:sz w:val="26"/>
-          <w:szCs w:val="26"/>
-        </w:rPr>
-        <w:t xml:space="preserve"> </w:t>
-      </w:r>
-      <w:proofErr w:type="spellStart"/>
-      <w:r>
-        <w:rPr>
-          <w:sz w:val="26"/>
-          <w:szCs w:val="26"/>
-        </w:rPr>
-        <w:t>bệnh</w:t>
-      </w:r>
-      <w:proofErr w:type="spellEnd"/>
-      <w:r>
-        <w:rPr>
-          <w:sz w:val="26"/>
-          <w:szCs w:val="26"/>
-        </w:rPr>
-        <w:t>:</w:t>
+          <w:u w:val="single"/>
+        </w:rPr>
+        <w:lastRenderedPageBreak/>
+        <w:t>Những</w:t>
+      </w:r>
+      <w:proofErr w:type="spellEnd"/>
+      <w:r>
+        <w:rPr>
+          <w:sz w:val="26"/>
+          <w:szCs w:val="26"/>
+          <w:u w:val="single"/>
+        </w:rPr>
+        <w:t xml:space="preserve"> </w:t>
+      </w:r>
+      <w:proofErr w:type="spellStart"/>
+      <w:r>
+        <w:rPr>
+          <w:sz w:val="26"/>
+          <w:szCs w:val="26"/>
+          <w:u w:val="single"/>
+        </w:rPr>
+        <w:t>dấu</w:t>
+      </w:r>
+      <w:proofErr w:type="spellEnd"/>
+      <w:r>
+        <w:rPr>
+          <w:sz w:val="26"/>
+          <w:szCs w:val="26"/>
+          <w:u w:val="single"/>
+        </w:rPr>
+        <w:t xml:space="preserve"> </w:t>
+      </w:r>
+      <w:proofErr w:type="spellStart"/>
+      <w:r>
+        <w:rPr>
+          <w:sz w:val="26"/>
+          <w:szCs w:val="26"/>
+          <w:u w:val="single"/>
+        </w:rPr>
+        <w:t>hiệu</w:t>
+      </w:r>
+      <w:proofErr w:type="spellEnd"/>
+      <w:r>
+        <w:rPr>
+          <w:sz w:val="26"/>
+          <w:szCs w:val="26"/>
+          <w:u w:val="single"/>
+        </w:rPr>
+        <w:t xml:space="preserve"> </w:t>
+      </w:r>
+      <w:proofErr w:type="spellStart"/>
+      <w:r>
+        <w:rPr>
+          <w:sz w:val="26"/>
+          <w:szCs w:val="26"/>
+          <w:u w:val="single"/>
+        </w:rPr>
+        <w:t>lâm</w:t>
+      </w:r>
+      <w:proofErr w:type="spellEnd"/>
+      <w:r>
+        <w:rPr>
+          <w:sz w:val="26"/>
+          <w:szCs w:val="26"/>
+          <w:u w:val="single"/>
+        </w:rPr>
+        <w:t xml:space="preserve"> </w:t>
+      </w:r>
+      <w:proofErr w:type="spellStart"/>
+      <w:r>
+        <w:rPr>
+          <w:sz w:val="26"/>
+          <w:szCs w:val="26"/>
+          <w:u w:val="single"/>
+        </w:rPr>
+        <w:t>sàng</w:t>
+      </w:r>
+      <w:proofErr w:type="spellEnd"/>
+      <w:r>
+        <w:rPr>
+          <w:sz w:val="26"/>
+          <w:szCs w:val="26"/>
+          <w:u w:val="single"/>
+        </w:rPr>
+        <w:t xml:space="preserve"> </w:t>
+      </w:r>
+      <w:proofErr w:type="spellStart"/>
+      <w:r>
+        <w:rPr>
+          <w:sz w:val="26"/>
+          <w:szCs w:val="26"/>
+          <w:u w:val="single"/>
+        </w:rPr>
+        <w:t>chính</w:t>
+      </w:r>
+      <w:proofErr w:type="spellEnd"/>
+      <w:r>
+        <w:rPr>
+          <w:sz w:val="26"/>
+          <w:szCs w:val="26"/>
+          <w:u w:val="single"/>
+        </w:rPr>
+        <w:t xml:space="preserve"> </w:t>
+      </w:r>
+      <w:proofErr w:type="spellStart"/>
+      <w:r>
+        <w:rPr>
+          <w:sz w:val="26"/>
+          <w:szCs w:val="26"/>
+          <w:u w:val="single"/>
+        </w:rPr>
+        <w:t>được</w:t>
+      </w:r>
+      <w:proofErr w:type="spellEnd"/>
+      <w:r>
+        <w:rPr>
+          <w:sz w:val="26"/>
+          <w:szCs w:val="26"/>
+          <w:u w:val="single"/>
+        </w:rPr>
+        <w:t xml:space="preserve"> </w:t>
+      </w:r>
+      <w:proofErr w:type="spellStart"/>
+      <w:r>
+        <w:rPr>
+          <w:sz w:val="26"/>
+          <w:szCs w:val="26"/>
+          <w:u w:val="single"/>
+        </w:rPr>
+        <w:t>ghi</w:t>
+      </w:r>
+      <w:proofErr w:type="spellEnd"/>
+      <w:r>
+        <w:rPr>
+          <w:sz w:val="26"/>
+          <w:szCs w:val="26"/>
+          <w:u w:val="single"/>
+        </w:rPr>
+        <w:t xml:space="preserve"> </w:t>
+      </w:r>
+      <w:proofErr w:type="spellStart"/>
+      <w:r>
+        <w:rPr>
+          <w:sz w:val="26"/>
+          <w:szCs w:val="26"/>
+          <w:u w:val="single"/>
+        </w:rPr>
+        <w:t>nhận</w:t>
+      </w:r>
+      <w:proofErr w:type="spellEnd"/>
+      <w:r>
+        <w:rPr>
+          <w:sz w:val="26"/>
+          <w:szCs w:val="26"/>
+          <w:u w:val="single"/>
+        </w:rPr>
+        <w:t xml:space="preserve"> (</w:t>
+      </w:r>
+      <w:proofErr w:type="spellStart"/>
+      <w:r>
+        <w:rPr>
+          <w:sz w:val="26"/>
+          <w:szCs w:val="26"/>
+          <w:u w:val="single"/>
+        </w:rPr>
+        <w:t>có</w:t>
+      </w:r>
+      <w:proofErr w:type="spellEnd"/>
+      <w:r>
+        <w:rPr>
+          <w:sz w:val="26"/>
+          <w:szCs w:val="26"/>
+          <w:u w:val="single"/>
+        </w:rPr>
+        <w:t xml:space="preserve"> </w:t>
+      </w:r>
+      <w:proofErr w:type="spellStart"/>
+      <w:r>
+        <w:rPr>
+          <w:sz w:val="26"/>
+          <w:szCs w:val="26"/>
+          <w:u w:val="single"/>
+        </w:rPr>
+        <w:t>giá</w:t>
+      </w:r>
+      <w:proofErr w:type="spellEnd"/>
+      <w:r>
+        <w:rPr>
+          <w:sz w:val="26"/>
+          <w:szCs w:val="26"/>
+          <w:u w:val="single"/>
+        </w:rPr>
+        <w:t xml:space="preserve"> </w:t>
+      </w:r>
+      <w:proofErr w:type="spellStart"/>
+      <w:r>
+        <w:rPr>
+          <w:sz w:val="26"/>
+          <w:szCs w:val="26"/>
+          <w:u w:val="single"/>
+        </w:rPr>
+        <w:t>trị</w:t>
+      </w:r>
+      <w:proofErr w:type="spellEnd"/>
+      <w:r>
+        <w:rPr>
+          <w:sz w:val="26"/>
+          <w:szCs w:val="26"/>
+          <w:u w:val="single"/>
+        </w:rPr>
+        <w:t xml:space="preserve"> </w:t>
+      </w:r>
+      <w:proofErr w:type="spellStart"/>
+      <w:r>
+        <w:rPr>
+          <w:sz w:val="26"/>
+          <w:szCs w:val="26"/>
+          <w:u w:val="single"/>
+        </w:rPr>
+        <w:t>chẩn</w:t>
+      </w:r>
+      <w:proofErr w:type="spellEnd"/>
+      <w:r>
+        <w:rPr>
+          <w:sz w:val="26"/>
+          <w:szCs w:val="26"/>
+          <w:u w:val="single"/>
+        </w:rPr>
+        <w:t xml:space="preserve"> </w:t>
+      </w:r>
+      <w:proofErr w:type="spellStart"/>
+      <w:r>
+        <w:rPr>
+          <w:sz w:val="26"/>
+          <w:szCs w:val="26"/>
+          <w:u w:val="single"/>
+        </w:rPr>
+        <w:t>đoán</w:t>
+      </w:r>
+      <w:proofErr w:type="spellEnd"/>
+      <w:r>
+        <w:rPr>
+          <w:sz w:val="26"/>
+          <w:szCs w:val="26"/>
+          <w:u w:val="single"/>
+        </w:rPr>
+        <w:t xml:space="preserve"> </w:t>
+      </w:r>
+      <w:proofErr w:type="spellStart"/>
+      <w:r>
+        <w:rPr>
+          <w:sz w:val="26"/>
+          <w:szCs w:val="26"/>
+          <w:u w:val="single"/>
+        </w:rPr>
+        <w:t>trong</w:t>
+      </w:r>
+      <w:proofErr w:type="spellEnd"/>
+      <w:r>
+        <w:rPr>
+          <w:sz w:val="26"/>
+          <w:szCs w:val="26"/>
+          <w:u w:val="single"/>
+        </w:rPr>
+        <w:t xml:space="preserve"> </w:t>
+      </w:r>
+      <w:proofErr w:type="spellStart"/>
+      <w:r>
+        <w:rPr>
+          <w:sz w:val="26"/>
+          <w:szCs w:val="26"/>
+          <w:u w:val="single"/>
+        </w:rPr>
+        <w:t>quá</w:t>
+      </w:r>
+      <w:proofErr w:type="spellEnd"/>
+      <w:r>
+        <w:rPr>
+          <w:sz w:val="26"/>
+          <w:szCs w:val="26"/>
+          <w:u w:val="single"/>
+        </w:rPr>
+        <w:t xml:space="preserve"> </w:t>
+      </w:r>
+      <w:proofErr w:type="spellStart"/>
+      <w:r>
+        <w:rPr>
+          <w:sz w:val="26"/>
+          <w:szCs w:val="26"/>
+          <w:u w:val="single"/>
+        </w:rPr>
+        <w:t>trình</w:t>
+      </w:r>
+      <w:proofErr w:type="spellEnd"/>
+      <w:r>
+        <w:rPr>
+          <w:sz w:val="26"/>
+          <w:szCs w:val="26"/>
+          <w:u w:val="single"/>
+        </w:rPr>
+        <w:t xml:space="preserve"> </w:t>
+      </w:r>
+      <w:proofErr w:type="spellStart"/>
+      <w:r>
+        <w:rPr>
+          <w:sz w:val="26"/>
+          <w:szCs w:val="26"/>
+          <w:u w:val="single"/>
+        </w:rPr>
+        <w:t>điều</w:t>
+      </w:r>
+      <w:proofErr w:type="spellEnd"/>
+      <w:r>
+        <w:rPr>
+          <w:sz w:val="26"/>
+          <w:szCs w:val="26"/>
+          <w:u w:val="single"/>
+        </w:rPr>
+        <w:t xml:space="preserve"> </w:t>
+      </w:r>
+      <w:proofErr w:type="spellStart"/>
+      <w:r>
+        <w:rPr>
+          <w:sz w:val="26"/>
+          <w:szCs w:val="26"/>
+          <w:u w:val="single"/>
+        </w:rPr>
+        <w:t>trị</w:t>
+      </w:r>
+      <w:proofErr w:type="spellEnd"/>
+      <w:r>
+        <w:rPr>
+          <w:sz w:val="26"/>
+          <w:szCs w:val="26"/>
+          <w:u w:val="single"/>
+        </w:rPr>
+        <w:t>):</w:t>
+      </w:r>
+      <w:r>
+        <w:rPr>
+          <w:sz w:val="26"/>
+          <w:szCs w:val="26"/>
+        </w:rPr>
+        <w:t xml:space="preserve"> </w:t>
+      </w:r>
+      <w:r>
+        <w:rPr>
+          <w:sz w:val="26"/>
+          <w:szCs w:val="26"/>
+        </w:rPr>
+        <w:t>{{</w:t>
+      </w:r>
+      <w:proofErr w:type="spellStart"/>
+      <w:r>
+        <w:rPr>
+          <w:sz w:val="26"/>
+          <w:szCs w:val="26"/>
+        </w:rPr>
+        <w:t>dau_hieu_chinh</w:t>
+      </w:r>
+      <w:proofErr w:type="spellEnd"/>
+      <w:r>
+        <w:rPr>
+          <w:sz w:val="26"/>
+          <w:szCs w:val="26"/>
+        </w:rPr>
+        <w:t>}}</w:t>
       </w:r>
     </w:p>
     <w:p>
@@ -2411,6 +2883,265 @@
           <w:szCs w:val="26"/>
         </w:rPr>
       </w:pPr>
+      <w:proofErr w:type="spellStart"/>
+      <w:r>
+        <w:rPr>
+          <w:sz w:val="26"/>
+          <w:szCs w:val="26"/>
+          <w:u w:val="single"/>
+        </w:rPr>
+        <w:t>Tóm</w:t>
+      </w:r>
+      <w:proofErr w:type="spellEnd"/>
+      <w:r>
+        <w:rPr>
+          <w:sz w:val="26"/>
+          <w:szCs w:val="26"/>
+          <w:u w:val="single"/>
+        </w:rPr>
+        <w:t xml:space="preserve"> </w:t>
+      </w:r>
+      <w:proofErr w:type="spellStart"/>
+      <w:r>
+        <w:rPr>
+          <w:sz w:val="26"/>
+          <w:szCs w:val="26"/>
+          <w:u w:val="single"/>
+        </w:rPr>
+        <w:t>tắt</w:t>
+      </w:r>
+      <w:proofErr w:type="spellEnd"/>
+      <w:r>
+        <w:rPr>
+          <w:sz w:val="26"/>
+          <w:szCs w:val="26"/>
+          <w:u w:val="single"/>
+        </w:rPr>
+        <w:t xml:space="preserve"> </w:t>
+      </w:r>
+      <w:proofErr w:type="spellStart"/>
+      <w:r>
+        <w:rPr>
+          <w:sz w:val="26"/>
+          <w:szCs w:val="26"/>
+          <w:u w:val="single"/>
+        </w:rPr>
+        <w:t>kết</w:t>
+      </w:r>
+      <w:proofErr w:type="spellEnd"/>
+      <w:r>
+        <w:rPr>
+          <w:sz w:val="26"/>
+          <w:szCs w:val="26"/>
+          <w:u w:val="single"/>
+        </w:rPr>
+        <w:t xml:space="preserve"> </w:t>
+      </w:r>
+      <w:proofErr w:type="spellStart"/>
+      <w:r>
+        <w:rPr>
+          <w:sz w:val="26"/>
+          <w:szCs w:val="26"/>
+          <w:u w:val="single"/>
+        </w:rPr>
+        <w:t>quả</w:t>
+      </w:r>
+      <w:proofErr w:type="spellEnd"/>
+      <w:r>
+        <w:rPr>
+          <w:sz w:val="26"/>
+          <w:szCs w:val="26"/>
+          <w:u w:val="single"/>
+        </w:rPr>
+        <w:t xml:space="preserve"> </w:t>
+      </w:r>
+      <w:proofErr w:type="spellStart"/>
+      <w:r>
+        <w:rPr>
+          <w:sz w:val="26"/>
+          <w:szCs w:val="26"/>
+          <w:u w:val="single"/>
+        </w:rPr>
+        <w:t>xét</w:t>
+      </w:r>
+      <w:proofErr w:type="spellEnd"/>
+      <w:r>
+        <w:rPr>
+          <w:sz w:val="26"/>
+          <w:szCs w:val="26"/>
+          <w:u w:val="single"/>
+        </w:rPr>
+        <w:t xml:space="preserve"> </w:t>
+      </w:r>
+      <w:proofErr w:type="spellStart"/>
+      <w:r>
+        <w:rPr>
+          <w:sz w:val="26"/>
+          <w:szCs w:val="26"/>
+          <w:u w:val="single"/>
+        </w:rPr>
+        <w:t>nghiệm</w:t>
+      </w:r>
+      <w:proofErr w:type="spellEnd"/>
+      <w:r>
+        <w:rPr>
+          <w:sz w:val="26"/>
+          <w:szCs w:val="26"/>
+          <w:u w:val="single"/>
+        </w:rPr>
+        <w:t xml:space="preserve">, </w:t>
+      </w:r>
+      <w:proofErr w:type="spellStart"/>
+      <w:r>
+        <w:rPr>
+          <w:sz w:val="26"/>
+          <w:szCs w:val="26"/>
+          <w:u w:val="single"/>
+        </w:rPr>
+        <w:t>cận</w:t>
+      </w:r>
+      <w:proofErr w:type="spellEnd"/>
+      <w:r>
+        <w:rPr>
+          <w:sz w:val="26"/>
+          <w:szCs w:val="26"/>
+          <w:u w:val="single"/>
+        </w:rPr>
+        <w:t xml:space="preserve"> </w:t>
+      </w:r>
+      <w:proofErr w:type="spellStart"/>
+      <w:r>
+        <w:rPr>
+          <w:sz w:val="26"/>
+          <w:szCs w:val="26"/>
+          <w:u w:val="single"/>
+        </w:rPr>
+        <w:t>lâm</w:t>
+      </w:r>
+      <w:proofErr w:type="spellEnd"/>
+      <w:r>
+        <w:rPr>
+          <w:sz w:val="26"/>
+          <w:szCs w:val="26"/>
+          <w:u w:val="single"/>
+        </w:rPr>
+        <w:t xml:space="preserve"> </w:t>
+      </w:r>
+      <w:proofErr w:type="spellStart"/>
+      <w:r>
+        <w:rPr>
+          <w:sz w:val="26"/>
+          <w:szCs w:val="26"/>
+          <w:u w:val="single"/>
+        </w:rPr>
+        <w:t>sàng</w:t>
+      </w:r>
+      <w:proofErr w:type="spellEnd"/>
+      <w:r>
+        <w:rPr>
+          <w:sz w:val="26"/>
+          <w:szCs w:val="26"/>
+          <w:u w:val="single"/>
+        </w:rPr>
+        <w:t xml:space="preserve"> </w:t>
+      </w:r>
+      <w:proofErr w:type="spellStart"/>
+      <w:r>
+        <w:rPr>
+          <w:sz w:val="26"/>
+          <w:szCs w:val="26"/>
+          <w:u w:val="single"/>
+        </w:rPr>
+        <w:t>có</w:t>
+      </w:r>
+      <w:proofErr w:type="spellEnd"/>
+      <w:r>
+        <w:rPr>
+          <w:sz w:val="26"/>
+          <w:szCs w:val="26"/>
+          <w:u w:val="single"/>
+        </w:rPr>
+        <w:t xml:space="preserve"> </w:t>
+      </w:r>
+      <w:proofErr w:type="spellStart"/>
+      <w:r>
+        <w:rPr>
+          <w:sz w:val="26"/>
+          <w:szCs w:val="26"/>
+          <w:u w:val="single"/>
+        </w:rPr>
+        <w:t>giá</w:t>
+      </w:r>
+      <w:proofErr w:type="spellEnd"/>
+      <w:r>
+        <w:rPr>
+          <w:sz w:val="26"/>
+          <w:szCs w:val="26"/>
+          <w:u w:val="single"/>
+        </w:rPr>
+        <w:t xml:space="preserve"> </w:t>
+      </w:r>
+      <w:proofErr w:type="spellStart"/>
+      <w:r>
+        <w:rPr>
+          <w:sz w:val="26"/>
+          <w:szCs w:val="26"/>
+          <w:u w:val="single"/>
+        </w:rPr>
+        <w:t>trị</w:t>
+      </w:r>
+      <w:proofErr w:type="spellEnd"/>
+      <w:r>
+        <w:rPr>
+          <w:sz w:val="26"/>
+          <w:szCs w:val="26"/>
+          <w:u w:val="single"/>
+        </w:rPr>
+        <w:t xml:space="preserve"> </w:t>
+      </w:r>
+      <w:proofErr w:type="spellStart"/>
+      <w:r>
+        <w:rPr>
+          <w:sz w:val="26"/>
+          <w:szCs w:val="26"/>
+          <w:u w:val="single"/>
+        </w:rPr>
+        <w:t>chẩn</w:t>
+      </w:r>
+      <w:proofErr w:type="spellEnd"/>
+      <w:r>
+        <w:rPr>
+          <w:sz w:val="26"/>
+          <w:szCs w:val="26"/>
+          <w:u w:val="single"/>
+        </w:rPr>
+        <w:t xml:space="preserve"> </w:t>
+      </w:r>
+      <w:proofErr w:type="spellStart"/>
+      <w:r>
+        <w:rPr>
+          <w:sz w:val="26"/>
+          <w:szCs w:val="26"/>
+          <w:u w:val="single"/>
+        </w:rPr>
+        <w:t>đoán</w:t>
+      </w:r>
+      <w:proofErr w:type="spellEnd"/>
+      <w:r>
+        <w:rPr>
+          <w:sz w:val="26"/>
+          <w:szCs w:val="26"/>
+          <w:u w:val="single"/>
+        </w:rPr>
+        <w:t>:</w:t>
+      </w:r>
+      <w:r>
+        <w:rPr>
+          <w:sz w:val="26"/>
+          <w:szCs w:val="26"/>
+        </w:rPr>
+        <w:t xml:space="preserve"> </w:t>
+      </w:r>
       <w:r>
         <w:rPr>
           <w:sz w:val="26"/>
@@ -2424,7 +3155,7 @@
           <w:sz w:val="26"/>
           <w:szCs w:val="26"/>
         </w:rPr>
-        <w:t>tien_su_benh</w:t>
+        <w:t>tom_tat_ket_qua</w:t>
       </w:r>
       <w:proofErr w:type="spellEnd"/>
       <w:r>
@@ -2441,149 +3172,68 @@
         <w:rPr>
           <w:sz w:val="26"/>
           <w:szCs w:val="26"/>
+          <w:u w:val="single"/>
         </w:rPr>
       </w:pPr>
-      <w:proofErr w:type="spellStart"/>
-      <w:r>
-        <w:rPr>
-          <w:sz w:val="26"/>
-          <w:szCs w:val="26"/>
-        </w:rPr>
-        <w:t>Những</w:t>
-      </w:r>
-      <w:proofErr w:type="spellEnd"/>
-      <w:r>
-        <w:rPr>
-          <w:sz w:val="26"/>
-          <w:szCs w:val="26"/>
-        </w:rPr>
-        <w:t xml:space="preserve"> </w:t>
-      </w:r>
-      <w:proofErr w:type="spellStart"/>
-      <w:r>
-        <w:rPr>
-          <w:sz w:val="26"/>
-          <w:szCs w:val="26"/>
-        </w:rPr>
-        <w:t>dấu</w:t>
-      </w:r>
-      <w:proofErr w:type="spellEnd"/>
-      <w:r>
-        <w:rPr>
-          <w:sz w:val="26"/>
-          <w:szCs w:val="26"/>
-        </w:rPr>
-        <w:t xml:space="preserve"> </w:t>
-      </w:r>
-      <w:proofErr w:type="spellStart"/>
-      <w:r>
-        <w:rPr>
-          <w:sz w:val="26"/>
-          <w:szCs w:val="26"/>
-        </w:rPr>
-        <w:t>hiệu</w:t>
-      </w:r>
-      <w:proofErr w:type="spellEnd"/>
-      <w:r>
-        <w:rPr>
-          <w:sz w:val="26"/>
-          <w:szCs w:val="26"/>
-        </w:rPr>
-        <w:t xml:space="preserve"> </w:t>
-      </w:r>
-      <w:proofErr w:type="spellStart"/>
-      <w:r>
-        <w:rPr>
-          <w:sz w:val="26"/>
-          <w:szCs w:val="26"/>
-        </w:rPr>
-        <w:t>lâm</w:t>
-      </w:r>
-      <w:proofErr w:type="spellEnd"/>
-      <w:r>
-        <w:rPr>
-          <w:sz w:val="26"/>
-          <w:szCs w:val="26"/>
-        </w:rPr>
-        <w:t xml:space="preserve"> </w:t>
-      </w:r>
-      <w:proofErr w:type="spellStart"/>
-      <w:r>
-        <w:rPr>
-          <w:sz w:val="26"/>
-          <w:szCs w:val="26"/>
-        </w:rPr>
-        <w:t>sàng</w:t>
-      </w:r>
-      <w:proofErr w:type="spellEnd"/>
-      <w:r>
-        <w:rPr>
-          <w:sz w:val="26"/>
-          <w:szCs w:val="26"/>
-        </w:rPr>
-        <w:t xml:space="preserve"> </w:t>
-      </w:r>
-      <w:proofErr w:type="spellStart"/>
-      <w:r>
-        <w:rPr>
-          <w:sz w:val="26"/>
-          <w:szCs w:val="26"/>
-        </w:rPr>
-        <w:t>chính</w:t>
-      </w:r>
-      <w:proofErr w:type="spellEnd"/>
-      <w:r>
-        <w:rPr>
-          <w:sz w:val="26"/>
-          <w:szCs w:val="26"/>
-        </w:rPr>
-        <w:t xml:space="preserve"> </w:t>
-      </w:r>
-      <w:proofErr w:type="spellStart"/>
-      <w:r>
-        <w:rPr>
-          <w:sz w:val="26"/>
-          <w:szCs w:val="26"/>
-        </w:rPr>
-        <w:t>được</w:t>
-      </w:r>
-      <w:proofErr w:type="spellEnd"/>
-      <w:r>
-        <w:rPr>
-          <w:sz w:val="26"/>
-          <w:szCs w:val="26"/>
-        </w:rPr>
-        <w:t xml:space="preserve"> </w:t>
-      </w:r>
-      <w:proofErr w:type="spellStart"/>
-      <w:r>
-        <w:rPr>
-          <w:sz w:val="26"/>
-          <w:szCs w:val="26"/>
-        </w:rPr>
-        <w:t>ghi</w:t>
-      </w:r>
-      <w:proofErr w:type="spellEnd"/>
-      <w:r>
-        <w:rPr>
-          <w:sz w:val="26"/>
-          <w:szCs w:val="26"/>
-        </w:rPr>
-        <w:t xml:space="preserve"> </w:t>
-      </w:r>
-      <w:proofErr w:type="spellStart"/>
-      <w:r>
-        <w:rPr>
-          <w:sz w:val="26"/>
-          <w:szCs w:val="26"/>
-        </w:rPr>
-        <w:t>nhận</w:t>
-      </w:r>
-      <w:proofErr w:type="spellEnd"/>
-      <w:r>
-        <w:rPr>
-          <w:sz w:val="26"/>
-          <w:szCs w:val="26"/>
+      <w:r>
+        <w:rPr>
+          <w:sz w:val="26"/>
+          <w:szCs w:val="26"/>
+          <w:u w:val="single"/>
+        </w:rPr>
+        <w:t xml:space="preserve">Phương </w:t>
+      </w:r>
+      <w:proofErr w:type="spellStart"/>
+      <w:r>
+        <w:rPr>
+          <w:sz w:val="26"/>
+          <w:szCs w:val="26"/>
+          <w:u w:val="single"/>
+        </w:rPr>
+        <w:t>pháp</w:t>
+      </w:r>
+      <w:proofErr w:type="spellEnd"/>
+      <w:r>
+        <w:rPr>
+          <w:sz w:val="26"/>
+          <w:szCs w:val="26"/>
+          <w:u w:val="single"/>
+        </w:rPr>
+        <w:t xml:space="preserve"> </w:t>
+      </w:r>
+      <w:proofErr w:type="spellStart"/>
+      <w:r>
+        <w:rPr>
+          <w:sz w:val="26"/>
+          <w:szCs w:val="26"/>
+          <w:u w:val="single"/>
+        </w:rPr>
+        <w:t>điều</w:t>
+      </w:r>
+      <w:proofErr w:type="spellEnd"/>
+      <w:r>
+        <w:rPr>
+          <w:sz w:val="26"/>
+          <w:szCs w:val="26"/>
+          <w:u w:val="single"/>
+        </w:rPr>
+        <w:t xml:space="preserve"> </w:t>
+      </w:r>
+      <w:proofErr w:type="spellStart"/>
+      <w:r>
+        <w:rPr>
+          <w:sz w:val="26"/>
+          <w:szCs w:val="26"/>
+          <w:u w:val="single"/>
+        </w:rPr>
+        <w:t>trị</w:t>
+      </w:r>
+      <w:proofErr w:type="spellEnd"/>
+      <w:r>
+        <w:rPr>
+          <w:sz w:val="26"/>
+          <w:szCs w:val="26"/>
+          <w:u w:val="single"/>
         </w:rPr>
         <w:t xml:space="preserve"> (</w:t>
       </w:r>
@@ -2592,54 +3242,61 @@
         <w:rPr>
           <w:sz w:val="26"/>
           <w:szCs w:val="26"/>
-        </w:rPr>
-        <w:t>có</w:t>
-      </w:r>
-      <w:proofErr w:type="spellEnd"/>
-      <w:r>
-        <w:rPr>
-          <w:sz w:val="26"/>
-          <w:szCs w:val="26"/>
-        </w:rPr>
-        <w:t xml:space="preserve"> </w:t>
-      </w:r>
-      <w:proofErr w:type="spellStart"/>
-      <w:r>
-        <w:rPr>
-          <w:sz w:val="26"/>
-          <w:szCs w:val="26"/>
-        </w:rPr>
-        <w:t>giá</w:t>
-      </w:r>
-      <w:proofErr w:type="spellEnd"/>
-      <w:r>
-        <w:rPr>
-          <w:sz w:val="26"/>
-          <w:szCs w:val="26"/>
-        </w:rPr>
-        <w:t xml:space="preserve"> </w:t>
-      </w:r>
-      <w:proofErr w:type="spellStart"/>
-      <w:r>
-        <w:rPr>
-          <w:sz w:val="26"/>
-          <w:szCs w:val="26"/>
-        </w:rPr>
-        <w:t>trị</w:t>
-      </w:r>
-      <w:proofErr w:type="spellEnd"/>
-      <w:r>
-        <w:rPr>
-          <w:sz w:val="26"/>
-          <w:szCs w:val="26"/>
-        </w:rPr>
-        <w:t xml:space="preserve"> </w:t>
-      </w:r>
-      <w:proofErr w:type="spellStart"/>
-      <w:r>
-        <w:rPr>
-          <w:sz w:val="26"/>
-          <w:szCs w:val="26"/>
+          <w:u w:val="single"/>
+        </w:rPr>
+        <w:t>tương</w:t>
+      </w:r>
+      <w:proofErr w:type="spellEnd"/>
+      <w:r>
+        <w:rPr>
+          <w:sz w:val="26"/>
+          <w:szCs w:val="26"/>
+          <w:u w:val="single"/>
+        </w:rPr>
+        <w:t xml:space="preserve"> </w:t>
+      </w:r>
+      <w:proofErr w:type="spellStart"/>
+      <w:r>
+        <w:rPr>
+          <w:sz w:val="26"/>
+          <w:szCs w:val="26"/>
+          <w:u w:val="single"/>
+        </w:rPr>
+        <w:t>ứng</w:t>
+      </w:r>
+      <w:proofErr w:type="spellEnd"/>
+      <w:r>
+        <w:rPr>
+          <w:sz w:val="26"/>
+          <w:szCs w:val="26"/>
+          <w:u w:val="single"/>
+        </w:rPr>
+        <w:t xml:space="preserve"> </w:t>
+      </w:r>
+      <w:proofErr w:type="spellStart"/>
+      <w:r>
+        <w:rPr>
+          <w:sz w:val="26"/>
+          <w:szCs w:val="26"/>
+          <w:u w:val="single"/>
+        </w:rPr>
+        <w:t>với</w:t>
+      </w:r>
+      <w:proofErr w:type="spellEnd"/>
+      <w:r>
+        <w:rPr>
+          <w:sz w:val="26"/>
+          <w:szCs w:val="26"/>
+          <w:u w:val="single"/>
+        </w:rPr>
+        <w:t xml:space="preserve"> </w:t>
+      </w:r>
+      <w:proofErr w:type="spellStart"/>
+      <w:r>
+        <w:rPr>
+          <w:sz w:val="26"/>
+          <w:szCs w:val="26"/>
+          <w:u w:val="single"/>
         </w:rPr>
         <w:t>chẩn</w:t>
       </w:r>
@@ -2648,14 +3305,16 @@
         <w:rPr>
           <w:sz w:val="26"/>
           <w:szCs w:val="26"/>
-        </w:rPr>
-        <w:t xml:space="preserve"> </w:t>
-      </w:r>
-      <w:proofErr w:type="spellStart"/>
-      <w:r>
-        <w:rPr>
-          <w:sz w:val="26"/>
-          <w:szCs w:val="26"/>
+          <w:u w:val="single"/>
+        </w:rPr>
+        <w:t xml:space="preserve"> </w:t>
+      </w:r>
+      <w:proofErr w:type="spellStart"/>
+      <w:r>
+        <w:rPr>
+          <w:sz w:val="26"/>
+          <w:szCs w:val="26"/>
+          <w:u w:val="single"/>
         </w:rPr>
         <w:t>đoán</w:t>
       </w:r>
@@ -2664,86 +3323,7 @@
         <w:rPr>
           <w:sz w:val="26"/>
           <w:szCs w:val="26"/>
-        </w:rPr>
-        <w:t xml:space="preserve"> </w:t>
-      </w:r>
-      <w:proofErr w:type="spellStart"/>
-      <w:r>
-        <w:rPr>
-          <w:sz w:val="26"/>
-          <w:szCs w:val="26"/>
-        </w:rPr>
-        <w:t>trong</w:t>
-      </w:r>
-      <w:proofErr w:type="spellEnd"/>
-      <w:r>
-        <w:rPr>
-          <w:sz w:val="26"/>
-          <w:szCs w:val="26"/>
-        </w:rPr>
-        <w:t xml:space="preserve"> </w:t>
-      </w:r>
-      <w:proofErr w:type="spellStart"/>
-      <w:r>
-        <w:rPr>
-          <w:sz w:val="26"/>
-          <w:szCs w:val="26"/>
-        </w:rPr>
-        <w:t>quá</w:t>
-      </w:r>
-      <w:proofErr w:type="spellEnd"/>
-      <w:r>
-        <w:rPr>
-          <w:sz w:val="26"/>
-          <w:szCs w:val="26"/>
-        </w:rPr>
-        <w:t xml:space="preserve"> </w:t>
-      </w:r>
-      <w:proofErr w:type="spellStart"/>
-      <w:r>
-        <w:rPr>
-          <w:sz w:val="26"/>
-          <w:szCs w:val="26"/>
-        </w:rPr>
-        <w:t>trình</w:t>
-      </w:r>
-      <w:proofErr w:type="spellEnd"/>
-      <w:r>
-        <w:rPr>
-          <w:sz w:val="26"/>
-          <w:szCs w:val="26"/>
-        </w:rPr>
-        <w:t xml:space="preserve"> </w:t>
-      </w:r>
-      <w:proofErr w:type="spellStart"/>
-      <w:r>
-        <w:rPr>
-          <w:sz w:val="26"/>
-          <w:szCs w:val="26"/>
-        </w:rPr>
-        <w:t>điều</w:t>
-      </w:r>
-      <w:proofErr w:type="spellEnd"/>
-      <w:r>
-        <w:rPr>
-          <w:sz w:val="26"/>
-          <w:szCs w:val="26"/>
-        </w:rPr>
-        <w:t xml:space="preserve"> </w:t>
-      </w:r>
-      <w:proofErr w:type="spellStart"/>
-      <w:r>
-        <w:rPr>
-          <w:sz w:val="26"/>
-          <w:szCs w:val="26"/>
-        </w:rPr>
-        <w:t>trị</w:t>
-      </w:r>
-      <w:proofErr w:type="spellEnd"/>
-      <w:r>
-        <w:rPr>
-          <w:sz w:val="26"/>
-          <w:szCs w:val="26"/>
+          <w:u w:val="single"/>
         </w:rPr>
         <w:t>):</w:t>
       </w:r>
@@ -2756,20 +3336,109 @@
           <w:szCs w:val="26"/>
         </w:rPr>
       </w:pPr>
-      <w:r>
-        <w:rPr>
-          <w:sz w:val="26"/>
-          <w:szCs w:val="26"/>
-        </w:rPr>
-        <w:t>{{</w:t>
-      </w:r>
-      <w:proofErr w:type="spellStart"/>
-      <w:r>
-        <w:rPr>
-          <w:sz w:val="26"/>
-          <w:szCs w:val="26"/>
-        </w:rPr>
-        <w:t>dau_hieu_chinh</w:t>
+      <w:proofErr w:type="spellStart"/>
+      <w:r>
+        <w:rPr>
+          <w:sz w:val="26"/>
+          <w:szCs w:val="26"/>
+          <w:u w:val="single"/>
+        </w:rPr>
+        <w:t>Nội</w:t>
+      </w:r>
+      <w:proofErr w:type="spellEnd"/>
+      <w:r>
+        <w:rPr>
+          <w:sz w:val="26"/>
+          <w:szCs w:val="26"/>
+          <w:u w:val="single"/>
+        </w:rPr>
+        <w:t xml:space="preserve"> khoa:</w:t>
+      </w:r>
+      <w:r>
+        <w:rPr>
+          <w:sz w:val="26"/>
+          <w:szCs w:val="26"/>
+        </w:rPr>
+        <w:t xml:space="preserve"> □ </w:t>
+      </w:r>
+      <w:proofErr w:type="spellStart"/>
+      <w:r>
+        <w:rPr>
+          <w:sz w:val="26"/>
+          <w:szCs w:val="26"/>
+        </w:rPr>
+        <w:t>Không</w:t>
+      </w:r>
+      <w:proofErr w:type="spellEnd"/>
+      <w:r>
+        <w:rPr>
+          <w:sz w:val="26"/>
+          <w:szCs w:val="26"/>
+        </w:rPr>
+        <w:t xml:space="preserve"> □ </w:t>
+      </w:r>
+      <w:proofErr w:type="spellStart"/>
+      <w:r>
+        <w:rPr>
+          <w:sz w:val="26"/>
+          <w:szCs w:val="26"/>
+        </w:rPr>
+        <w:t>Có</w:t>
+      </w:r>
+      <w:proofErr w:type="spellEnd"/>
+      <w:r>
+        <w:rPr>
+          <w:sz w:val="26"/>
+          <w:szCs w:val="26"/>
+        </w:rPr>
+        <w:t xml:space="preserve">, </w:t>
+      </w:r>
+      <w:proofErr w:type="spellStart"/>
+      <w:r>
+        <w:rPr>
+          <w:sz w:val="26"/>
+          <w:szCs w:val="26"/>
+        </w:rPr>
+        <w:t>ghi</w:t>
+      </w:r>
+      <w:proofErr w:type="spellEnd"/>
+      <w:r>
+        <w:rPr>
+          <w:sz w:val="26"/>
+          <w:szCs w:val="26"/>
+        </w:rPr>
+        <w:t xml:space="preserve"> </w:t>
+      </w:r>
+      <w:proofErr w:type="spellStart"/>
+      <w:r>
+        <w:rPr>
+          <w:sz w:val="26"/>
+          <w:szCs w:val="26"/>
+        </w:rPr>
+        <w:t>rõ</w:t>
+      </w:r>
+      <w:proofErr w:type="spellEnd"/>
+      <w:r>
+        <w:rPr>
+          <w:sz w:val="26"/>
+          <w:szCs w:val="26"/>
+        </w:rPr>
+        <w:t>:</w:t>
+      </w:r>
+      <w:r>
+        <w:rPr>
+          <w:sz w:val="26"/>
+          <w:szCs w:val="26"/>
+        </w:rPr>
+        <w:t xml:space="preserve"> {{</w:t>
+      </w:r>
+      <w:proofErr w:type="spellStart"/>
+      <w:r>
+        <w:rPr>
+          <w:sz w:val="26"/>
+          <w:szCs w:val="26"/>
+        </w:rPr>
+        <w:t>departmentid</w:t>
       </w:r>
       <w:proofErr w:type="spellEnd"/>
       <w:r>
@@ -2793,94 +3462,34 @@
         <w:rPr>
           <w:sz w:val="26"/>
           <w:szCs w:val="26"/>
-        </w:rPr>
-        <w:t>Tóm</w:t>
-      </w:r>
-      <w:proofErr w:type="spellEnd"/>
-      <w:r>
-        <w:rPr>
-          <w:sz w:val="26"/>
-          <w:szCs w:val="26"/>
-        </w:rPr>
-        <w:t xml:space="preserve"> </w:t>
-      </w:r>
-      <w:proofErr w:type="spellStart"/>
-      <w:r>
-        <w:rPr>
-          <w:sz w:val="26"/>
-          <w:szCs w:val="26"/>
-        </w:rPr>
-        <w:t>tắt</w:t>
-      </w:r>
-      <w:proofErr w:type="spellEnd"/>
-      <w:r>
-        <w:rPr>
-          <w:sz w:val="26"/>
-          <w:szCs w:val="26"/>
-        </w:rPr>
-        <w:t xml:space="preserve"> </w:t>
-      </w:r>
-      <w:proofErr w:type="spellStart"/>
-      <w:r>
-        <w:rPr>
-          <w:sz w:val="26"/>
-          <w:szCs w:val="26"/>
-        </w:rPr>
-        <w:t>kết</w:t>
-      </w:r>
-      <w:proofErr w:type="spellEnd"/>
-      <w:r>
-        <w:rPr>
-          <w:sz w:val="26"/>
-          <w:szCs w:val="26"/>
-        </w:rPr>
-        <w:t xml:space="preserve"> </w:t>
-      </w:r>
-      <w:proofErr w:type="spellStart"/>
-      <w:r>
-        <w:rPr>
-          <w:sz w:val="26"/>
-          <w:szCs w:val="26"/>
-        </w:rPr>
-        <w:t>quả</w:t>
-      </w:r>
-      <w:proofErr w:type="spellEnd"/>
-      <w:r>
-        <w:rPr>
-          <w:sz w:val="26"/>
-          <w:szCs w:val="26"/>
-        </w:rPr>
-        <w:t xml:space="preserve"> </w:t>
-      </w:r>
-      <w:proofErr w:type="spellStart"/>
-      <w:r>
-        <w:rPr>
-          <w:sz w:val="26"/>
-          <w:szCs w:val="26"/>
-        </w:rPr>
-        <w:t>xét</w:t>
-      </w:r>
-      <w:proofErr w:type="spellEnd"/>
-      <w:r>
-        <w:rPr>
-          <w:sz w:val="26"/>
-          <w:szCs w:val="26"/>
-        </w:rPr>
-        <w:t xml:space="preserve"> </w:t>
-      </w:r>
-      <w:proofErr w:type="spellStart"/>
-      <w:r>
-        <w:rPr>
-          <w:sz w:val="26"/>
-          <w:szCs w:val="26"/>
-        </w:rPr>
-        <w:t>nghiệm</w:t>
-      </w:r>
-      <w:proofErr w:type="spellEnd"/>
-      <w:r>
-        <w:rPr>
-          <w:sz w:val="26"/>
-          <w:szCs w:val="26"/>
+          <w:u w:val="single"/>
+        </w:rPr>
+        <w:t>Phẫu</w:t>
+      </w:r>
+      <w:proofErr w:type="spellEnd"/>
+      <w:r>
+        <w:rPr>
+          <w:sz w:val="26"/>
+          <w:szCs w:val="26"/>
+          <w:u w:val="single"/>
+        </w:rPr>
+        <w:t xml:space="preserve"> </w:t>
+      </w:r>
+      <w:proofErr w:type="spellStart"/>
+      <w:r>
+        <w:rPr>
+          <w:sz w:val="26"/>
+          <w:szCs w:val="26"/>
+          <w:u w:val="single"/>
+        </w:rPr>
+        <w:t>thuật</w:t>
+      </w:r>
+      <w:proofErr w:type="spellEnd"/>
+      <w:r>
+        <w:rPr>
+          <w:sz w:val="26"/>
+          <w:szCs w:val="26"/>
+          <w:u w:val="single"/>
         </w:rPr>
         <w:t xml:space="preserve">, </w:t>
       </w:r>
@@ -2889,128 +3498,169 @@
         <w:rPr>
           <w:sz w:val="26"/>
           <w:szCs w:val="26"/>
-        </w:rPr>
-        <w:t>cận</w:t>
-      </w:r>
-      <w:proofErr w:type="spellEnd"/>
-      <w:r>
-        <w:rPr>
-          <w:sz w:val="26"/>
-          <w:szCs w:val="26"/>
-        </w:rPr>
-        <w:t xml:space="preserve"> </w:t>
-      </w:r>
-      <w:proofErr w:type="spellStart"/>
-      <w:r>
-        <w:rPr>
-          <w:sz w:val="26"/>
-          <w:szCs w:val="26"/>
-        </w:rPr>
-        <w:t>lâm</w:t>
-      </w:r>
-      <w:proofErr w:type="spellEnd"/>
-      <w:r>
-        <w:rPr>
-          <w:sz w:val="26"/>
-          <w:szCs w:val="26"/>
-        </w:rPr>
-        <w:t xml:space="preserve"> </w:t>
-      </w:r>
-      <w:proofErr w:type="spellStart"/>
-      <w:r>
-        <w:rPr>
-          <w:sz w:val="26"/>
-          <w:szCs w:val="26"/>
-        </w:rPr>
-        <w:t>sàng</w:t>
-      </w:r>
-      <w:proofErr w:type="spellEnd"/>
-      <w:r>
-        <w:rPr>
-          <w:sz w:val="26"/>
-          <w:szCs w:val="26"/>
-        </w:rPr>
-        <w:t xml:space="preserve"> </w:t>
-      </w:r>
-      <w:proofErr w:type="spellStart"/>
-      <w:r>
-        <w:rPr>
-          <w:sz w:val="26"/>
-          <w:szCs w:val="26"/>
-        </w:rPr>
-        <w:t>có</w:t>
-      </w:r>
-      <w:proofErr w:type="spellEnd"/>
-      <w:r>
-        <w:rPr>
-          <w:sz w:val="26"/>
-          <w:szCs w:val="26"/>
-        </w:rPr>
-        <w:t xml:space="preserve"> </w:t>
-      </w:r>
-      <w:proofErr w:type="spellStart"/>
-      <w:r>
-        <w:rPr>
-          <w:sz w:val="26"/>
-          <w:szCs w:val="26"/>
-        </w:rPr>
-        <w:t>giá</w:t>
-      </w:r>
-      <w:proofErr w:type="spellEnd"/>
-      <w:r>
-        <w:rPr>
-          <w:sz w:val="26"/>
-          <w:szCs w:val="26"/>
-        </w:rPr>
-        <w:t xml:space="preserve"> </w:t>
-      </w:r>
-      <w:proofErr w:type="spellStart"/>
-      <w:r>
-        <w:rPr>
-          <w:sz w:val="26"/>
-          <w:szCs w:val="26"/>
-        </w:rPr>
-        <w:t>trị</w:t>
-      </w:r>
-      <w:proofErr w:type="spellEnd"/>
-      <w:r>
-        <w:rPr>
-          <w:sz w:val="26"/>
-          <w:szCs w:val="26"/>
-        </w:rPr>
-        <w:t xml:space="preserve"> </w:t>
-      </w:r>
-      <w:proofErr w:type="spellStart"/>
-      <w:r>
-        <w:rPr>
-          <w:sz w:val="26"/>
-          <w:szCs w:val="26"/>
-        </w:rPr>
-        <w:t>chẩn</w:t>
-      </w:r>
-      <w:proofErr w:type="spellEnd"/>
-      <w:r>
-        <w:rPr>
-          <w:sz w:val="26"/>
-          <w:szCs w:val="26"/>
-        </w:rPr>
-        <w:t xml:space="preserve"> </w:t>
-      </w:r>
-      <w:proofErr w:type="spellStart"/>
-      <w:r>
-        <w:rPr>
-          <w:sz w:val="26"/>
-          <w:szCs w:val="26"/>
-        </w:rPr>
-        <w:t>đoán</w:t>
-      </w:r>
-      <w:proofErr w:type="spellEnd"/>
-      <w:r>
-        <w:rPr>
-          <w:sz w:val="26"/>
-          <w:szCs w:val="26"/>
+          <w:u w:val="single"/>
+        </w:rPr>
+        <w:t>thủ</w:t>
+      </w:r>
+      <w:proofErr w:type="spellEnd"/>
+      <w:r>
+        <w:rPr>
+          <w:sz w:val="26"/>
+          <w:szCs w:val="26"/>
+          <w:u w:val="single"/>
+        </w:rPr>
+        <w:t xml:space="preserve"> </w:t>
+      </w:r>
+      <w:proofErr w:type="spellStart"/>
+      <w:r>
+        <w:rPr>
+          <w:sz w:val="26"/>
+          <w:szCs w:val="26"/>
+          <w:u w:val="single"/>
+        </w:rPr>
+        <w:t>thuật</w:t>
+      </w:r>
+      <w:proofErr w:type="spellEnd"/>
+      <w:r>
+        <w:rPr>
+          <w:sz w:val="26"/>
+          <w:szCs w:val="26"/>
+          <w:u w:val="single"/>
         </w:rPr>
         <w:t>:</w:t>
+      </w:r>
+      <w:r>
+        <w:rPr>
+          <w:sz w:val="26"/>
+          <w:szCs w:val="26"/>
+        </w:rPr>
+        <w:t xml:space="preserve"> □ </w:t>
+      </w:r>
+      <w:proofErr w:type="spellStart"/>
+      <w:r>
+        <w:rPr>
+          <w:sz w:val="26"/>
+          <w:szCs w:val="26"/>
+        </w:rPr>
+        <w:t>Không</w:t>
+      </w:r>
+      <w:proofErr w:type="spellEnd"/>
+      <w:r>
+        <w:rPr>
+          <w:sz w:val="26"/>
+          <w:szCs w:val="26"/>
+        </w:rPr>
+        <w:t xml:space="preserve"> □ </w:t>
+      </w:r>
+      <w:proofErr w:type="spellStart"/>
+      <w:r>
+        <w:rPr>
+          <w:sz w:val="26"/>
+          <w:szCs w:val="26"/>
+        </w:rPr>
+        <w:t>Có</w:t>
+      </w:r>
+      <w:proofErr w:type="spellEnd"/>
+      <w:r>
+        <w:rPr>
+          <w:sz w:val="26"/>
+          <w:szCs w:val="26"/>
+        </w:rPr>
+        <w:t xml:space="preserve">, </w:t>
+      </w:r>
+      <w:proofErr w:type="spellStart"/>
+      <w:r>
+        <w:rPr>
+          <w:sz w:val="26"/>
+          <w:szCs w:val="26"/>
+        </w:rPr>
+        <w:t>ghi</w:t>
+      </w:r>
+      <w:proofErr w:type="spellEnd"/>
+      <w:r>
+        <w:rPr>
+          <w:sz w:val="26"/>
+          <w:szCs w:val="26"/>
+        </w:rPr>
+        <w:t xml:space="preserve"> </w:t>
+      </w:r>
+      <w:proofErr w:type="spellStart"/>
+      <w:r>
+        <w:rPr>
+          <w:sz w:val="26"/>
+          <w:szCs w:val="26"/>
+        </w:rPr>
+        <w:t>rõ</w:t>
+      </w:r>
+      <w:proofErr w:type="spellEnd"/>
+      <w:r>
+        <w:rPr>
+          <w:sz w:val="26"/>
+          <w:szCs w:val="26"/>
+        </w:rPr>
+        <w:t xml:space="preserve"> </w:t>
+      </w:r>
+      <w:proofErr w:type="spellStart"/>
+      <w:r>
+        <w:rPr>
+          <w:sz w:val="26"/>
+          <w:szCs w:val="26"/>
+        </w:rPr>
+        <w:t>phương</w:t>
+      </w:r>
+      <w:proofErr w:type="spellEnd"/>
+      <w:r>
+        <w:rPr>
+          <w:sz w:val="26"/>
+          <w:szCs w:val="26"/>
+        </w:rPr>
+        <w:t xml:space="preserve"> </w:t>
+      </w:r>
+      <w:proofErr w:type="spellStart"/>
+      <w:r>
+        <w:rPr>
+          <w:sz w:val="26"/>
+          <w:szCs w:val="26"/>
+        </w:rPr>
+        <w:t>pháp</w:t>
+      </w:r>
+      <w:proofErr w:type="spellEnd"/>
+      <w:r>
+        <w:rPr>
+          <w:sz w:val="26"/>
+          <w:szCs w:val="26"/>
+        </w:rPr>
+        <w:t>:</w:t>
+      </w:r>
+      <w:r>
+        <w:rPr>
+          <w:sz w:val="26"/>
+          <w:szCs w:val="26"/>
+        </w:rPr>
+        <w:t xml:space="preserve"> </w:t>
+      </w:r>
+      <w:r>
+        <w:rPr>
+          <w:sz w:val="26"/>
+          <w:szCs w:val="26"/>
+        </w:rPr>
+        <w:t>{{</w:t>
+      </w:r>
+      <w:proofErr w:type="spellStart"/>
+      <w:r>
+        <w:rPr>
+          <w:sz w:val="26"/>
+          <w:szCs w:val="26"/>
+        </w:rPr>
+        <w:t>pttt</w:t>
+      </w:r>
+      <w:proofErr w:type="spellEnd"/>
+      <w:r>
+        <w:rPr>
+          <w:sz w:val="26"/>
+          <w:szCs w:val="26"/>
+        </w:rPr>
+        <w:t>}}</w:t>
       </w:r>
     </w:p>
     <w:p>
@@ -3019,30 +3669,80 @@
         <w:rPr>
           <w:sz w:val="26"/>
           <w:szCs w:val="26"/>
+          <w:u w:val="single"/>
         </w:rPr>
       </w:pPr>
-      <w:r>
-        <w:rPr>
-          <w:sz w:val="26"/>
-          <w:szCs w:val="26"/>
-        </w:rPr>
-        <w:t>{{</w:t>
-      </w:r>
-      <w:proofErr w:type="spellStart"/>
-      <w:r>
-        <w:rPr>
-          <w:sz w:val="26"/>
-          <w:szCs w:val="26"/>
-        </w:rPr>
-        <w:t>tom_tat_ket_qua</w:t>
-      </w:r>
-      <w:proofErr w:type="spellEnd"/>
-      <w:r>
-        <w:rPr>
-          <w:sz w:val="26"/>
-          <w:szCs w:val="26"/>
-        </w:rPr>
-        <w:t>}}</w:t>
+      <w:proofErr w:type="spellStart"/>
+      <w:r>
+        <w:rPr>
+          <w:sz w:val="26"/>
+          <w:szCs w:val="26"/>
+          <w:u w:val="single"/>
+        </w:rPr>
+        <w:t>Tình</w:t>
+      </w:r>
+      <w:proofErr w:type="spellEnd"/>
+      <w:r>
+        <w:rPr>
+          <w:sz w:val="26"/>
+          <w:szCs w:val="26"/>
+          <w:u w:val="single"/>
+        </w:rPr>
+        <w:t xml:space="preserve"> </w:t>
+      </w:r>
+      <w:proofErr w:type="spellStart"/>
+      <w:r>
+        <w:rPr>
+          <w:sz w:val="26"/>
+          <w:szCs w:val="26"/>
+          <w:u w:val="single"/>
+        </w:rPr>
+        <w:t>trạng</w:t>
+      </w:r>
+      <w:proofErr w:type="spellEnd"/>
+      <w:r>
+        <w:rPr>
+          <w:sz w:val="26"/>
+          <w:szCs w:val="26"/>
+          <w:u w:val="single"/>
+        </w:rPr>
+        <w:t xml:space="preserve"> </w:t>
+      </w:r>
+      <w:proofErr w:type="spellStart"/>
+      <w:r>
+        <w:rPr>
+          <w:sz w:val="26"/>
+          <w:szCs w:val="26"/>
+          <w:u w:val="single"/>
+        </w:rPr>
+        <w:t>ra</w:t>
+      </w:r>
+      <w:proofErr w:type="spellEnd"/>
+      <w:r>
+        <w:rPr>
+          <w:sz w:val="26"/>
+          <w:szCs w:val="26"/>
+          <w:u w:val="single"/>
+        </w:rPr>
+        <w:t xml:space="preserve"> </w:t>
+      </w:r>
+      <w:proofErr w:type="spellStart"/>
+      <w:r>
+        <w:rPr>
+          <w:sz w:val="26"/>
+          <w:szCs w:val="26"/>
+          <w:u w:val="single"/>
+        </w:rPr>
+        <w:t>viện</w:t>
+      </w:r>
+      <w:proofErr w:type="spellEnd"/>
+      <w:r>
+        <w:rPr>
+          <w:sz w:val="26"/>
+          <w:szCs w:val="26"/>
+          <w:u w:val="single"/>
+        </w:rPr>
+        <w:t>:</w:t>
       </w:r>
     </w:p>
     <w:p>
@@ -3058,136 +3758,209 @@
           <w:sz w:val="26"/>
           <w:szCs w:val="26"/>
         </w:rPr>
-        <w:t xml:space="preserve">Phương </w:t>
-      </w:r>
-      <w:proofErr w:type="spellStart"/>
-      <w:r>
-        <w:rPr>
-          <w:sz w:val="26"/>
-          <w:szCs w:val="26"/>
-        </w:rPr>
-        <w:t>pháp</w:t>
-      </w:r>
-      <w:proofErr w:type="spellEnd"/>
-      <w:r>
-        <w:rPr>
-          <w:sz w:val="26"/>
-          <w:szCs w:val="26"/>
-        </w:rPr>
-        <w:t xml:space="preserve"> </w:t>
-      </w:r>
-      <w:proofErr w:type="spellStart"/>
-      <w:r>
-        <w:rPr>
-          <w:sz w:val="26"/>
-          <w:szCs w:val="26"/>
-        </w:rPr>
-        <w:t>điều</w:t>
-      </w:r>
-      <w:proofErr w:type="spellEnd"/>
-      <w:r>
-        <w:rPr>
-          <w:sz w:val="26"/>
-          <w:szCs w:val="26"/>
-        </w:rPr>
-        <w:t xml:space="preserve"> </w:t>
-      </w:r>
-      <w:proofErr w:type="spellStart"/>
-      <w:r>
-        <w:rPr>
-          <w:sz w:val="26"/>
-          <w:szCs w:val="26"/>
-        </w:rPr>
-        <w:t>trị</w:t>
-      </w:r>
-      <w:proofErr w:type="spellEnd"/>
-      <w:r>
-        <w:rPr>
-          <w:sz w:val="26"/>
-          <w:szCs w:val="26"/>
-        </w:rPr>
-        <w:t xml:space="preserve"> (</w:t>
-      </w:r>
-      <w:proofErr w:type="spellStart"/>
-      <w:r>
-        <w:rPr>
-          <w:sz w:val="26"/>
-          <w:szCs w:val="26"/>
-        </w:rPr>
-        <w:t>tương</w:t>
-      </w:r>
-      <w:proofErr w:type="spellEnd"/>
-      <w:r>
-        <w:rPr>
-          <w:sz w:val="26"/>
-          <w:szCs w:val="26"/>
-        </w:rPr>
-        <w:t xml:space="preserve"> </w:t>
-      </w:r>
-      <w:proofErr w:type="spellStart"/>
-      <w:r>
-        <w:rPr>
-          <w:sz w:val="26"/>
-          <w:szCs w:val="26"/>
-        </w:rPr>
-        <w:t>ứng</w:t>
-      </w:r>
-      <w:proofErr w:type="spellEnd"/>
-      <w:r>
-        <w:rPr>
-          <w:sz w:val="26"/>
-          <w:szCs w:val="26"/>
-        </w:rPr>
-        <w:t xml:space="preserve"> </w:t>
-      </w:r>
-      <w:proofErr w:type="spellStart"/>
-      <w:r>
-        <w:rPr>
-          <w:sz w:val="26"/>
-          <w:szCs w:val="26"/>
-        </w:rPr>
-        <w:t>với</w:t>
-      </w:r>
-      <w:proofErr w:type="spellEnd"/>
-      <w:r>
-        <w:rPr>
-          <w:sz w:val="26"/>
-          <w:szCs w:val="26"/>
-        </w:rPr>
-        <w:t xml:space="preserve"> </w:t>
-      </w:r>
-      <w:proofErr w:type="spellStart"/>
-      <w:r>
-        <w:rPr>
-          <w:sz w:val="26"/>
-          <w:szCs w:val="26"/>
-        </w:rPr>
-        <w:t>chẩn</w:t>
-      </w:r>
-      <w:proofErr w:type="spellEnd"/>
-      <w:r>
-        <w:rPr>
-          <w:sz w:val="26"/>
-          <w:szCs w:val="26"/>
-        </w:rPr>
-        <w:t xml:space="preserve"> </w:t>
-      </w:r>
-      <w:proofErr w:type="spellStart"/>
-      <w:r>
-        <w:rPr>
-          <w:sz w:val="26"/>
-          <w:szCs w:val="26"/>
-        </w:rPr>
-        <w:t>đoán</w:t>
-      </w:r>
-      <w:proofErr w:type="spellEnd"/>
-      <w:r>
-        <w:rPr>
-          <w:sz w:val="26"/>
-          <w:szCs w:val="26"/>
-        </w:rPr>
-        <w:t>):</w:t>
-      </w:r>
+        <w:t xml:space="preserve">□ </w:t>
+      </w:r>
+      <w:proofErr w:type="spellStart"/>
+      <w:r>
+        <w:rPr>
+          <w:sz w:val="26"/>
+          <w:szCs w:val="26"/>
+        </w:rPr>
+        <w:t>Khỏi</w:t>
+      </w:r>
+      <w:proofErr w:type="spellEnd"/>
+      <w:r>
+        <w:rPr>
+          <w:sz w:val="26"/>
+          <w:szCs w:val="26"/>
+        </w:rPr>
+        <w:t xml:space="preserve"> □ </w:t>
+      </w:r>
+      <w:proofErr w:type="spellStart"/>
+      <w:r>
+        <w:rPr>
+          <w:sz w:val="26"/>
+          <w:szCs w:val="26"/>
+        </w:rPr>
+        <w:t>Đỡ</w:t>
+      </w:r>
+      <w:proofErr w:type="spellEnd"/>
+      <w:r>
+        <w:rPr>
+          <w:sz w:val="26"/>
+          <w:szCs w:val="26"/>
+        </w:rPr>
+        <w:t xml:space="preserve"> □ </w:t>
+      </w:r>
+      <w:proofErr w:type="spellStart"/>
+      <w:r>
+        <w:rPr>
+          <w:sz w:val="26"/>
+          <w:szCs w:val="26"/>
+        </w:rPr>
+        <w:t>Không</w:t>
+      </w:r>
+      <w:proofErr w:type="spellEnd"/>
+      <w:r>
+        <w:rPr>
+          <w:sz w:val="26"/>
+          <w:szCs w:val="26"/>
+        </w:rPr>
+        <w:t xml:space="preserve"> </w:t>
+      </w:r>
+      <w:proofErr w:type="spellStart"/>
+      <w:r>
+        <w:rPr>
+          <w:sz w:val="26"/>
+          <w:szCs w:val="26"/>
+        </w:rPr>
+        <w:t>thay</w:t>
+      </w:r>
+      <w:proofErr w:type="spellEnd"/>
+      <w:r>
+        <w:rPr>
+          <w:sz w:val="26"/>
+          <w:szCs w:val="26"/>
+        </w:rPr>
+        <w:t xml:space="preserve"> </w:t>
+      </w:r>
+      <w:proofErr w:type="spellStart"/>
+      <w:r>
+        <w:rPr>
+          <w:sz w:val="26"/>
+          <w:szCs w:val="26"/>
+        </w:rPr>
+        <w:t>đổi</w:t>
+      </w:r>
+      <w:proofErr w:type="spellEnd"/>
+      <w:r>
+        <w:rPr>
+          <w:sz w:val="26"/>
+          <w:szCs w:val="26"/>
+        </w:rPr>
+        <w:t xml:space="preserve"> □ </w:t>
+      </w:r>
+      <w:proofErr w:type="spellStart"/>
+      <w:r>
+        <w:rPr>
+          <w:sz w:val="26"/>
+          <w:szCs w:val="26"/>
+        </w:rPr>
+        <w:t>Nặng</w:t>
+      </w:r>
+      <w:proofErr w:type="spellEnd"/>
+      <w:r>
+        <w:rPr>
+          <w:sz w:val="26"/>
+          <w:szCs w:val="26"/>
+        </w:rPr>
+        <w:t xml:space="preserve"> </w:t>
+      </w:r>
+      <w:proofErr w:type="spellStart"/>
+      <w:r>
+        <w:rPr>
+          <w:sz w:val="26"/>
+          <w:szCs w:val="26"/>
+        </w:rPr>
+        <w:t>hơn</w:t>
+      </w:r>
+      <w:proofErr w:type="spellEnd"/>
+      <w:r>
+        <w:rPr>
+          <w:sz w:val="26"/>
+          <w:szCs w:val="26"/>
+        </w:rPr>
+        <w:t xml:space="preserve"> □ </w:t>
+      </w:r>
+      <w:proofErr w:type="spellStart"/>
+      <w:r>
+        <w:rPr>
+          <w:sz w:val="26"/>
+          <w:szCs w:val="26"/>
+        </w:rPr>
+        <w:t>Tử</w:t>
+      </w:r>
+      <w:proofErr w:type="spellEnd"/>
+      <w:r>
+        <w:rPr>
+          <w:sz w:val="26"/>
+          <w:szCs w:val="26"/>
+        </w:rPr>
+        <w:t xml:space="preserve"> </w:t>
+      </w:r>
+      <w:proofErr w:type="spellStart"/>
+      <w:r>
+        <w:rPr>
+          <w:sz w:val="26"/>
+          <w:szCs w:val="26"/>
+        </w:rPr>
+        <w:t>vong</w:t>
+      </w:r>
+      <w:proofErr w:type="spellEnd"/>
+      <w:r>
+        <w:rPr>
+          <w:sz w:val="26"/>
+          <w:szCs w:val="26"/>
+        </w:rPr>
+        <w:t xml:space="preserve"> □ Tiên </w:t>
+      </w:r>
+      <w:proofErr w:type="spellStart"/>
+      <w:r>
+        <w:rPr>
+          <w:sz w:val="26"/>
+          <w:szCs w:val="26"/>
+        </w:rPr>
+        <w:t>lượng</w:t>
+      </w:r>
+      <w:proofErr w:type="spellEnd"/>
+      <w:r>
+        <w:rPr>
+          <w:sz w:val="26"/>
+          <w:szCs w:val="26"/>
+        </w:rPr>
+        <w:t xml:space="preserve"> </w:t>
+      </w:r>
+      <w:proofErr w:type="spellStart"/>
+      <w:r>
+        <w:rPr>
+          <w:sz w:val="26"/>
+          <w:szCs w:val="26"/>
+        </w:rPr>
+        <w:t>nặng</w:t>
+      </w:r>
+      <w:proofErr w:type="spellEnd"/>
+      <w:r>
+        <w:rPr>
+          <w:sz w:val="26"/>
+          <w:szCs w:val="26"/>
+        </w:rPr>
+        <w:t xml:space="preserve"> </w:t>
+      </w:r>
+      <w:proofErr w:type="spellStart"/>
+      <w:r>
+        <w:rPr>
+          <w:sz w:val="26"/>
+          <w:szCs w:val="26"/>
+        </w:rPr>
+        <w:t>xin</w:t>
+      </w:r>
+      <w:proofErr w:type="spellEnd"/>
+      <w:r>
+        <w:rPr>
+          <w:sz w:val="26"/>
+          <w:szCs w:val="26"/>
+        </w:rPr>
+        <w:t xml:space="preserve"> </w:t>
+      </w:r>
+      <w:proofErr w:type="spellStart"/>
+      <w:r>
+        <w:rPr>
+          <w:sz w:val="26"/>
+          <w:szCs w:val="26"/>
+        </w:rPr>
+        <w:t>về</w:t>
+      </w:r>
+      <w:proofErr w:type="spellEnd"/>
     </w:p>
     <w:p>
       <w:pPr>
@@ -3197,109 +3970,54 @@
           <w:szCs w:val="26"/>
         </w:rPr>
       </w:pPr>
-      <w:proofErr w:type="spellStart"/>
-      <w:r>
-        <w:rPr>
-          <w:sz w:val="26"/>
-          <w:szCs w:val="26"/>
-        </w:rPr>
-        <w:t>Nội</w:t>
-      </w:r>
-      <w:proofErr w:type="spellEnd"/>
-      <w:r>
-        <w:rPr>
-          <w:sz w:val="26"/>
-          <w:szCs w:val="26"/>
-        </w:rPr>
-        <w:t xml:space="preserve"> khoa: □ </w:t>
-      </w:r>
-      <w:proofErr w:type="spellStart"/>
-      <w:r>
-        <w:rPr>
-          <w:sz w:val="26"/>
-          <w:szCs w:val="26"/>
-        </w:rPr>
-        <w:t>Không</w:t>
-      </w:r>
-      <w:proofErr w:type="spellEnd"/>
-      <w:r>
-        <w:rPr>
-          <w:sz w:val="26"/>
-          <w:szCs w:val="26"/>
-        </w:rPr>
-        <w:t xml:space="preserve"> □ </w:t>
-      </w:r>
-      <w:proofErr w:type="spellStart"/>
-      <w:r>
-        <w:rPr>
-          <w:sz w:val="26"/>
-          <w:szCs w:val="26"/>
-        </w:rPr>
-        <w:t>Có</w:t>
-      </w:r>
-      <w:proofErr w:type="spellEnd"/>
-      <w:r>
-        <w:rPr>
-          <w:sz w:val="26"/>
-          <w:szCs w:val="26"/>
-        </w:rPr>
-        <w:t xml:space="preserve">, </w:t>
-      </w:r>
-      <w:proofErr w:type="spellStart"/>
-      <w:r>
-        <w:rPr>
-          <w:sz w:val="26"/>
-          <w:szCs w:val="26"/>
-        </w:rPr>
-        <w:t>ghi</w:t>
-      </w:r>
-      <w:proofErr w:type="spellEnd"/>
-      <w:r>
-        <w:rPr>
-          <w:sz w:val="26"/>
-          <w:szCs w:val="26"/>
-        </w:rPr>
-        <w:t xml:space="preserve"> </w:t>
-      </w:r>
-      <w:proofErr w:type="spellStart"/>
-      <w:r>
-        <w:rPr>
-          <w:sz w:val="26"/>
-          <w:szCs w:val="26"/>
-        </w:rPr>
-        <w:t>rõ</w:t>
-      </w:r>
-      <w:proofErr w:type="spellEnd"/>
-      <w:r>
-        <w:rPr>
-          <w:sz w:val="26"/>
-          <w:szCs w:val="26"/>
-        </w:rPr>
-        <w:t>:</w:t>
-      </w:r>
-      <w:r>
-        <w:rPr>
-          <w:sz w:val="26"/>
-          <w:szCs w:val="26"/>
-        </w:rPr>
-        <w:t xml:space="preserve"> {{</w:t>
-      </w:r>
-      <w:proofErr w:type="spellStart"/>
-      <w:r>
-        <w:rPr>
-          <w:sz w:val="26"/>
-          <w:szCs w:val="26"/>
-        </w:rPr>
-        <w:t>departmentid</w:t>
-      </w:r>
-      <w:proofErr w:type="spellEnd"/>
-      <w:r>
-        <w:rPr>
-          <w:sz w:val="26"/>
-          <w:szCs w:val="26"/>
-        </w:rPr>
-        <w:t xml:space="preserve"> }}</w:t>
-      </w:r>
+      <w:r>
+        <w:rPr>
+          <w:sz w:val="26"/>
+          <w:szCs w:val="26"/>
+        </w:rPr>
+        <w:t xml:space="preserve">□ </w:t>
+      </w:r>
+      <w:proofErr w:type="spellStart"/>
+      <w:r>
+        <w:rPr>
+          <w:sz w:val="26"/>
+          <w:szCs w:val="26"/>
+        </w:rPr>
+        <w:t>Chưa</w:t>
+      </w:r>
+      <w:proofErr w:type="spellEnd"/>
+      <w:r>
+        <w:rPr>
+          <w:sz w:val="26"/>
+          <w:szCs w:val="26"/>
+        </w:rPr>
+        <w:t xml:space="preserve"> </w:t>
+      </w:r>
+      <w:proofErr w:type="spellStart"/>
+      <w:r>
+        <w:rPr>
+          <w:sz w:val="26"/>
+          <w:szCs w:val="26"/>
+        </w:rPr>
+        <w:t>xác</w:t>
+      </w:r>
+      <w:proofErr w:type="spellEnd"/>
+      <w:r>
+        <w:rPr>
+          <w:sz w:val="26"/>
+          <w:szCs w:val="26"/>
+        </w:rPr>
+        <w:t xml:space="preserve"> </w:t>
+      </w:r>
+      <w:proofErr w:type="spellStart"/>
+      <w:r>
+        <w:rPr>
+          <w:sz w:val="26"/>
+          <w:szCs w:val="26"/>
+        </w:rPr>
+        <w:t>định</w:t>
+      </w:r>
+      <w:proofErr w:type="spellEnd"/>
     </w:p>
     <w:p>
       <w:pPr>
@@ -3307,6 +4025,7 @@
         <w:rPr>
           <w:sz w:val="26"/>
           <w:szCs w:val="26"/>
+          <w:u w:val="single"/>
         </w:rPr>
       </w:pPr>
       <w:proofErr w:type="spellStart"/>
@@ -3314,702 +4033,171 @@
         <w:rPr>
           <w:sz w:val="26"/>
           <w:szCs w:val="26"/>
-        </w:rPr>
-        <w:t>Phẫu</w:t>
-      </w:r>
-      <w:proofErr w:type="spellEnd"/>
-      <w:r>
-        <w:rPr>
-          <w:sz w:val="26"/>
-          <w:szCs w:val="26"/>
-        </w:rPr>
-        <w:t xml:space="preserve"> </w:t>
-      </w:r>
-      <w:proofErr w:type="spellStart"/>
-      <w:r>
-        <w:rPr>
-          <w:sz w:val="26"/>
-          <w:szCs w:val="26"/>
-        </w:rPr>
-        <w:t>thuật</w:t>
-      </w:r>
-      <w:proofErr w:type="spellEnd"/>
-      <w:r>
-        <w:rPr>
-          <w:sz w:val="26"/>
-          <w:szCs w:val="26"/>
-        </w:rPr>
-        <w:t xml:space="preserve">, </w:t>
-      </w:r>
-      <w:proofErr w:type="spellStart"/>
-      <w:r>
-        <w:rPr>
-          <w:sz w:val="26"/>
-          <w:szCs w:val="26"/>
-        </w:rPr>
-        <w:t>thủ</w:t>
-      </w:r>
-      <w:proofErr w:type="spellEnd"/>
-      <w:r>
-        <w:rPr>
-          <w:sz w:val="26"/>
-          <w:szCs w:val="26"/>
-        </w:rPr>
-        <w:t xml:space="preserve"> </w:t>
-      </w:r>
-      <w:proofErr w:type="spellStart"/>
-      <w:r>
-        <w:rPr>
-          <w:sz w:val="26"/>
-          <w:szCs w:val="26"/>
-        </w:rPr>
-        <w:t>thuật</w:t>
-      </w:r>
-      <w:proofErr w:type="spellEnd"/>
-      <w:r>
-        <w:rPr>
-          <w:sz w:val="26"/>
-          <w:szCs w:val="26"/>
-        </w:rPr>
-        <w:t xml:space="preserve">: □ </w:t>
-      </w:r>
-      <w:proofErr w:type="spellStart"/>
-      <w:r>
-        <w:rPr>
-          <w:sz w:val="26"/>
-          <w:szCs w:val="26"/>
-        </w:rPr>
-        <w:t>Không</w:t>
-      </w:r>
-      <w:proofErr w:type="spellEnd"/>
-      <w:r>
-        <w:rPr>
-          <w:sz w:val="26"/>
-          <w:szCs w:val="26"/>
-        </w:rPr>
-        <w:t xml:space="preserve"> □ </w:t>
-      </w:r>
-      <w:proofErr w:type="spellStart"/>
-      <w:r>
-        <w:rPr>
-          <w:sz w:val="26"/>
-          <w:szCs w:val="26"/>
-        </w:rPr>
-        <w:t>Có</w:t>
-      </w:r>
-      <w:proofErr w:type="spellEnd"/>
-      <w:r>
-        <w:rPr>
-          <w:sz w:val="26"/>
-          <w:szCs w:val="26"/>
-        </w:rPr>
-        <w:t xml:space="preserve">, </w:t>
-      </w:r>
-      <w:proofErr w:type="spellStart"/>
-      <w:r>
-        <w:rPr>
-          <w:sz w:val="26"/>
-          <w:szCs w:val="26"/>
-        </w:rPr>
-        <w:t>ghi</w:t>
-      </w:r>
-      <w:proofErr w:type="spellEnd"/>
-      <w:r>
-        <w:rPr>
-          <w:sz w:val="26"/>
-          <w:szCs w:val="26"/>
-        </w:rPr>
-        <w:t xml:space="preserve"> </w:t>
-      </w:r>
-      <w:proofErr w:type="spellStart"/>
-      <w:r>
-        <w:rPr>
-          <w:sz w:val="26"/>
-          <w:szCs w:val="26"/>
-        </w:rPr>
-        <w:t>rõ</w:t>
-      </w:r>
-      <w:proofErr w:type="spellEnd"/>
-      <w:r>
-        <w:rPr>
-          <w:sz w:val="26"/>
-          <w:szCs w:val="26"/>
-        </w:rPr>
-        <w:t xml:space="preserve"> </w:t>
-      </w:r>
-      <w:proofErr w:type="spellStart"/>
-      <w:r>
-        <w:rPr>
-          <w:sz w:val="26"/>
-          <w:szCs w:val="26"/>
-        </w:rPr>
-        <w:t>phương</w:t>
-      </w:r>
-      <w:proofErr w:type="spellEnd"/>
-      <w:r>
-        <w:rPr>
-          <w:sz w:val="26"/>
-          <w:szCs w:val="26"/>
-        </w:rPr>
-        <w:t xml:space="preserve"> </w:t>
-      </w:r>
-      <w:proofErr w:type="spellStart"/>
-      <w:r>
-        <w:rPr>
-          <w:sz w:val="26"/>
-          <w:szCs w:val="26"/>
-        </w:rPr>
-        <w:t>pháp</w:t>
-      </w:r>
-      <w:proofErr w:type="spellEnd"/>
-      <w:r>
-        <w:rPr>
-          <w:sz w:val="26"/>
-          <w:szCs w:val="26"/>
+          <w:u w:val="single"/>
+        </w:rPr>
+        <w:t>Hướng</w:t>
+      </w:r>
+      <w:proofErr w:type="spellEnd"/>
+      <w:r>
+        <w:rPr>
+          <w:sz w:val="26"/>
+          <w:szCs w:val="26"/>
+          <w:u w:val="single"/>
+        </w:rPr>
+        <w:t xml:space="preserve"> </w:t>
+      </w:r>
+      <w:proofErr w:type="spellStart"/>
+      <w:r>
+        <w:rPr>
+          <w:sz w:val="26"/>
+          <w:szCs w:val="26"/>
+          <w:u w:val="single"/>
+        </w:rPr>
+        <w:t>điều</w:t>
+      </w:r>
+      <w:proofErr w:type="spellEnd"/>
+      <w:r>
+        <w:rPr>
+          <w:sz w:val="26"/>
+          <w:szCs w:val="26"/>
+          <w:u w:val="single"/>
+        </w:rPr>
+        <w:t xml:space="preserve"> </w:t>
+      </w:r>
+      <w:proofErr w:type="spellStart"/>
+      <w:r>
+        <w:rPr>
+          <w:sz w:val="26"/>
+          <w:szCs w:val="26"/>
+          <w:u w:val="single"/>
+        </w:rPr>
+        <w:t>trị</w:t>
+      </w:r>
+      <w:proofErr w:type="spellEnd"/>
+      <w:r>
+        <w:rPr>
+          <w:sz w:val="26"/>
+          <w:szCs w:val="26"/>
+          <w:u w:val="single"/>
+        </w:rPr>
+        <w:t xml:space="preserve"> </w:t>
+      </w:r>
+      <w:proofErr w:type="spellStart"/>
+      <w:r>
+        <w:rPr>
+          <w:sz w:val="26"/>
+          <w:szCs w:val="26"/>
+          <w:u w:val="single"/>
+        </w:rPr>
+        <w:t>và</w:t>
+      </w:r>
+      <w:proofErr w:type="spellEnd"/>
+      <w:r>
+        <w:rPr>
+          <w:sz w:val="26"/>
+          <w:szCs w:val="26"/>
+          <w:u w:val="single"/>
+        </w:rPr>
+        <w:t xml:space="preserve"> </w:t>
+      </w:r>
+      <w:proofErr w:type="spellStart"/>
+      <w:r>
+        <w:rPr>
+          <w:sz w:val="26"/>
+          <w:szCs w:val="26"/>
+          <w:u w:val="single"/>
+        </w:rPr>
+        <w:t>các</w:t>
+      </w:r>
+      <w:proofErr w:type="spellEnd"/>
+      <w:r>
+        <w:rPr>
+          <w:sz w:val="26"/>
+          <w:szCs w:val="26"/>
+          <w:u w:val="single"/>
+        </w:rPr>
+        <w:t xml:space="preserve"> </w:t>
+      </w:r>
+      <w:proofErr w:type="spellStart"/>
+      <w:r>
+        <w:rPr>
+          <w:sz w:val="26"/>
+          <w:szCs w:val="26"/>
+          <w:u w:val="single"/>
+        </w:rPr>
+        <w:t>chế</w:t>
+      </w:r>
+      <w:proofErr w:type="spellEnd"/>
+      <w:r>
+        <w:rPr>
+          <w:sz w:val="26"/>
+          <w:szCs w:val="26"/>
+          <w:u w:val="single"/>
+        </w:rPr>
+        <w:t xml:space="preserve"> </w:t>
+      </w:r>
+      <w:proofErr w:type="spellStart"/>
+      <w:r>
+        <w:rPr>
+          <w:sz w:val="26"/>
+          <w:szCs w:val="26"/>
+          <w:u w:val="single"/>
+        </w:rPr>
+        <w:t>độ</w:t>
+      </w:r>
+      <w:proofErr w:type="spellEnd"/>
+      <w:r>
+        <w:rPr>
+          <w:sz w:val="26"/>
+          <w:szCs w:val="26"/>
+          <w:u w:val="single"/>
+        </w:rPr>
+        <w:t xml:space="preserve"> </w:t>
+      </w:r>
+      <w:proofErr w:type="spellStart"/>
+      <w:r>
+        <w:rPr>
+          <w:sz w:val="26"/>
+          <w:szCs w:val="26"/>
+          <w:u w:val="single"/>
+        </w:rPr>
+        <w:t>tiếp</w:t>
+      </w:r>
+      <w:proofErr w:type="spellEnd"/>
+      <w:r>
+        <w:rPr>
+          <w:sz w:val="26"/>
+          <w:szCs w:val="26"/>
+          <w:u w:val="single"/>
+        </w:rPr>
+        <w:t xml:space="preserve"> </w:t>
+      </w:r>
+      <w:proofErr w:type="spellStart"/>
+      <w:r>
+        <w:rPr>
+          <w:sz w:val="26"/>
+          <w:szCs w:val="26"/>
+          <w:u w:val="single"/>
+        </w:rPr>
+        <w:t>theo</w:t>
+      </w:r>
+      <w:proofErr w:type="spellEnd"/>
+      <w:r>
+        <w:rPr>
+          <w:sz w:val="26"/>
+          <w:szCs w:val="26"/>
+          <w:u w:val="single"/>
         </w:rPr>
         <w:t>:</w:t>
       </w:r>
-    </w:p>
-    <w:p>
-      <w:pPr>
-        <w:spacing w:before="120" w:after="280" w:afterAutospacing="1"/>
-        <w:rPr>
-          <w:sz w:val="26"/>
-          <w:szCs w:val="26"/>
-        </w:rPr>
-      </w:pPr>
-      <w:r>
-        <w:rPr>
-          <w:sz w:val="26"/>
-          <w:szCs w:val="26"/>
-        </w:rPr>
-        <w:t>{{</w:t>
-      </w:r>
-      <w:proofErr w:type="spellStart"/>
-      <w:r>
-        <w:rPr>
-          <w:sz w:val="26"/>
-          <w:szCs w:val="26"/>
-        </w:rPr>
-        <w:t>pttt</w:t>
-      </w:r>
-      <w:proofErr w:type="spellEnd"/>
-      <w:r>
-        <w:rPr>
-          <w:sz w:val="26"/>
-          <w:szCs w:val="26"/>
-        </w:rPr>
-        <w:t>}}</w:t>
-      </w:r>
-    </w:p>
-    <w:p>
-      <w:pPr>
-        <w:spacing w:before="120" w:after="280" w:afterAutospacing="1"/>
-        <w:rPr>
-          <w:sz w:val="26"/>
-          <w:szCs w:val="26"/>
-        </w:rPr>
-      </w:pPr>
-      <w:proofErr w:type="spellStart"/>
-      <w:r>
-        <w:rPr>
-          <w:sz w:val="26"/>
-          <w:szCs w:val="26"/>
-        </w:rPr>
-        <w:t>Tình</w:t>
-      </w:r>
-      <w:proofErr w:type="spellEnd"/>
-      <w:r>
-        <w:rPr>
-          <w:sz w:val="26"/>
-          <w:szCs w:val="26"/>
-        </w:rPr>
-        <w:t xml:space="preserve"> </w:t>
-      </w:r>
-      <w:proofErr w:type="spellStart"/>
-      <w:r>
-        <w:rPr>
-          <w:sz w:val="26"/>
-          <w:szCs w:val="26"/>
-        </w:rPr>
-        <w:t>trạng</w:t>
-      </w:r>
-      <w:proofErr w:type="spellEnd"/>
-      <w:r>
-        <w:rPr>
-          <w:sz w:val="26"/>
-          <w:szCs w:val="26"/>
-        </w:rPr>
-        <w:t xml:space="preserve"> </w:t>
-      </w:r>
-      <w:proofErr w:type="spellStart"/>
-      <w:r>
-        <w:rPr>
-          <w:sz w:val="26"/>
-          <w:szCs w:val="26"/>
-        </w:rPr>
-        <w:t>ra</w:t>
-      </w:r>
-      <w:proofErr w:type="spellEnd"/>
-      <w:r>
-        <w:rPr>
-          <w:sz w:val="26"/>
-          <w:szCs w:val="26"/>
-        </w:rPr>
-        <w:t xml:space="preserve"> </w:t>
-      </w:r>
-      <w:proofErr w:type="spellStart"/>
-      <w:r>
-        <w:rPr>
-          <w:sz w:val="26"/>
-          <w:szCs w:val="26"/>
-        </w:rPr>
-        <w:t>viện</w:t>
-      </w:r>
-      <w:proofErr w:type="spellEnd"/>
-      <w:r>
-        <w:rPr>
-          <w:sz w:val="26"/>
-          <w:szCs w:val="26"/>
-        </w:rPr>
-        <w:t>:</w:t>
-      </w:r>
-    </w:p>
-    <w:p>
-      <w:pPr>
-        <w:spacing w:before="120" w:after="280" w:afterAutospacing="1"/>
-        <w:rPr>
-          <w:sz w:val="26"/>
-          <w:szCs w:val="26"/>
-        </w:rPr>
-      </w:pPr>
-      <w:r>
-        <w:rPr>
-          <w:sz w:val="26"/>
-          <w:szCs w:val="26"/>
-        </w:rPr>
-        <w:t xml:space="preserve">□ </w:t>
-      </w:r>
-      <w:proofErr w:type="spellStart"/>
-      <w:r>
-        <w:rPr>
-          <w:sz w:val="26"/>
-          <w:szCs w:val="26"/>
-        </w:rPr>
-        <w:t>Khỏi</w:t>
-      </w:r>
-      <w:proofErr w:type="spellEnd"/>
-      <w:r>
-        <w:rPr>
-          <w:sz w:val="26"/>
-          <w:szCs w:val="26"/>
-        </w:rPr>
-        <w:t xml:space="preserve"> □ </w:t>
-      </w:r>
-      <w:proofErr w:type="spellStart"/>
-      <w:r>
-        <w:rPr>
-          <w:sz w:val="26"/>
-          <w:szCs w:val="26"/>
-        </w:rPr>
-        <w:t>Đỡ</w:t>
-      </w:r>
-      <w:proofErr w:type="spellEnd"/>
-      <w:r>
-        <w:rPr>
-          <w:sz w:val="26"/>
-          <w:szCs w:val="26"/>
-        </w:rPr>
-        <w:t xml:space="preserve"> □ </w:t>
-      </w:r>
-      <w:proofErr w:type="spellStart"/>
-      <w:r>
-        <w:rPr>
-          <w:sz w:val="26"/>
-          <w:szCs w:val="26"/>
-        </w:rPr>
-        <w:t>Không</w:t>
-      </w:r>
-      <w:proofErr w:type="spellEnd"/>
-      <w:r>
-        <w:rPr>
-          <w:sz w:val="26"/>
-          <w:szCs w:val="26"/>
-        </w:rPr>
-        <w:t xml:space="preserve"> </w:t>
-      </w:r>
-      <w:proofErr w:type="spellStart"/>
-      <w:r>
-        <w:rPr>
-          <w:sz w:val="26"/>
-          <w:szCs w:val="26"/>
-        </w:rPr>
-        <w:t>thay</w:t>
-      </w:r>
-      <w:proofErr w:type="spellEnd"/>
-      <w:r>
-        <w:rPr>
-          <w:sz w:val="26"/>
-          <w:szCs w:val="26"/>
-        </w:rPr>
-        <w:t xml:space="preserve"> </w:t>
-      </w:r>
-      <w:proofErr w:type="spellStart"/>
-      <w:r>
-        <w:rPr>
-          <w:sz w:val="26"/>
-          <w:szCs w:val="26"/>
-        </w:rPr>
-        <w:t>đổi</w:t>
-      </w:r>
-      <w:proofErr w:type="spellEnd"/>
-      <w:r>
-        <w:rPr>
-          <w:sz w:val="26"/>
-          <w:szCs w:val="26"/>
-        </w:rPr>
-        <w:t xml:space="preserve"> □ </w:t>
-      </w:r>
-      <w:proofErr w:type="spellStart"/>
-      <w:r>
-        <w:rPr>
-          <w:sz w:val="26"/>
-          <w:szCs w:val="26"/>
-        </w:rPr>
-        <w:t>Nặng</w:t>
-      </w:r>
-      <w:proofErr w:type="spellEnd"/>
-      <w:r>
-        <w:rPr>
-          <w:sz w:val="26"/>
-          <w:szCs w:val="26"/>
-        </w:rPr>
-        <w:t xml:space="preserve"> </w:t>
-      </w:r>
-      <w:proofErr w:type="spellStart"/>
-      <w:r>
-        <w:rPr>
-          <w:sz w:val="26"/>
-          <w:szCs w:val="26"/>
-        </w:rPr>
-        <w:t>hơn</w:t>
-      </w:r>
-      <w:proofErr w:type="spellEnd"/>
-      <w:r>
-        <w:rPr>
-          <w:sz w:val="26"/>
-          <w:szCs w:val="26"/>
-        </w:rPr>
-        <w:t xml:space="preserve"> □ </w:t>
-      </w:r>
-      <w:proofErr w:type="spellStart"/>
-      <w:r>
-        <w:rPr>
-          <w:sz w:val="26"/>
-          <w:szCs w:val="26"/>
-        </w:rPr>
-        <w:t>Tử</w:t>
-      </w:r>
-      <w:proofErr w:type="spellEnd"/>
-      <w:r>
-        <w:rPr>
-          <w:sz w:val="26"/>
-          <w:szCs w:val="26"/>
-        </w:rPr>
-        <w:t xml:space="preserve"> </w:t>
-      </w:r>
-      <w:proofErr w:type="spellStart"/>
-      <w:r>
-        <w:rPr>
-          <w:sz w:val="26"/>
-          <w:szCs w:val="26"/>
-        </w:rPr>
-        <w:t>vong</w:t>
-      </w:r>
-      <w:proofErr w:type="spellEnd"/>
-      <w:r>
-        <w:rPr>
-          <w:sz w:val="26"/>
-          <w:szCs w:val="26"/>
-        </w:rPr>
-        <w:t xml:space="preserve"> □ Tiên </w:t>
-      </w:r>
-      <w:proofErr w:type="spellStart"/>
-      <w:r>
-        <w:rPr>
-          <w:sz w:val="26"/>
-          <w:szCs w:val="26"/>
-        </w:rPr>
-        <w:t>lượng</w:t>
-      </w:r>
-      <w:proofErr w:type="spellEnd"/>
-      <w:r>
-        <w:rPr>
-          <w:sz w:val="26"/>
-          <w:szCs w:val="26"/>
-        </w:rPr>
-        <w:t xml:space="preserve"> </w:t>
-      </w:r>
-      <w:proofErr w:type="spellStart"/>
-      <w:r>
-        <w:rPr>
-          <w:sz w:val="26"/>
-          <w:szCs w:val="26"/>
-        </w:rPr>
-        <w:t>nặng</w:t>
-      </w:r>
-      <w:proofErr w:type="spellEnd"/>
-      <w:r>
-        <w:rPr>
-          <w:sz w:val="26"/>
-          <w:szCs w:val="26"/>
-        </w:rPr>
-        <w:t xml:space="preserve"> </w:t>
-      </w:r>
-      <w:proofErr w:type="spellStart"/>
-      <w:r>
-        <w:rPr>
-          <w:sz w:val="26"/>
-          <w:szCs w:val="26"/>
-        </w:rPr>
-        <w:t>xin</w:t>
-      </w:r>
-      <w:proofErr w:type="spellEnd"/>
-      <w:r>
-        <w:rPr>
-          <w:sz w:val="26"/>
-          <w:szCs w:val="26"/>
-        </w:rPr>
-        <w:t xml:space="preserve"> </w:t>
-      </w:r>
-      <w:proofErr w:type="spellStart"/>
-      <w:r>
-        <w:rPr>
-          <w:sz w:val="26"/>
-          <w:szCs w:val="26"/>
-        </w:rPr>
-        <w:t>về</w:t>
-      </w:r>
-      <w:proofErr w:type="spellEnd"/>
-    </w:p>
-    <w:p>
-      <w:pPr>
-        <w:spacing w:before="120" w:after="280" w:afterAutospacing="1"/>
-        <w:rPr>
-          <w:sz w:val="26"/>
-          <w:szCs w:val="26"/>
-        </w:rPr>
-      </w:pPr>
-      <w:r>
-        <w:rPr>
-          <w:sz w:val="26"/>
-          <w:szCs w:val="26"/>
-        </w:rPr>
-        <w:t xml:space="preserve">□ </w:t>
-      </w:r>
-      <w:proofErr w:type="spellStart"/>
-      <w:r>
-        <w:rPr>
-          <w:sz w:val="26"/>
-          <w:szCs w:val="26"/>
-        </w:rPr>
-        <w:t>Chưa</w:t>
-      </w:r>
-      <w:proofErr w:type="spellEnd"/>
-      <w:r>
-        <w:rPr>
-          <w:sz w:val="26"/>
-          <w:szCs w:val="26"/>
-        </w:rPr>
-        <w:t xml:space="preserve"> </w:t>
-      </w:r>
-      <w:proofErr w:type="spellStart"/>
-      <w:r>
-        <w:rPr>
-          <w:sz w:val="26"/>
-          <w:szCs w:val="26"/>
-        </w:rPr>
-        <w:t>xác</w:t>
-      </w:r>
-      <w:proofErr w:type="spellEnd"/>
-      <w:r>
-        <w:rPr>
-          <w:sz w:val="26"/>
-          <w:szCs w:val="26"/>
-        </w:rPr>
-        <w:t xml:space="preserve"> </w:t>
-      </w:r>
-      <w:proofErr w:type="spellStart"/>
-      <w:r>
-        <w:rPr>
-          <w:sz w:val="26"/>
-          <w:szCs w:val="26"/>
-        </w:rPr>
-        <w:t>định</w:t>
-      </w:r>
-      <w:proofErr w:type="spellEnd"/>
-    </w:p>
-    <w:p>
-      <w:pPr>
-        <w:spacing w:before="120" w:after="280" w:afterAutospacing="1"/>
-        <w:rPr>
-          <w:sz w:val="26"/>
-          <w:szCs w:val="26"/>
-        </w:rPr>
-      </w:pPr>
-      <w:proofErr w:type="spellStart"/>
-      <w:r>
-        <w:rPr>
-          <w:sz w:val="26"/>
-          <w:szCs w:val="26"/>
-        </w:rPr>
-        <w:t>Hướng</w:t>
-      </w:r>
-      <w:proofErr w:type="spellEnd"/>
-      <w:r>
-        <w:rPr>
-          <w:sz w:val="26"/>
-          <w:szCs w:val="26"/>
-        </w:rPr>
-        <w:t xml:space="preserve"> </w:t>
-      </w:r>
-      <w:proofErr w:type="spellStart"/>
-      <w:r>
-        <w:rPr>
-          <w:sz w:val="26"/>
-          <w:szCs w:val="26"/>
-        </w:rPr>
-        <w:t>điều</w:t>
-      </w:r>
-      <w:proofErr w:type="spellEnd"/>
-      <w:r>
-        <w:rPr>
-          <w:sz w:val="26"/>
-          <w:szCs w:val="26"/>
-        </w:rPr>
-        <w:t xml:space="preserve"> </w:t>
-      </w:r>
-      <w:proofErr w:type="spellStart"/>
-      <w:r>
-        <w:rPr>
-          <w:sz w:val="26"/>
-          <w:szCs w:val="26"/>
-        </w:rPr>
-        <w:t>trị</w:t>
-      </w:r>
-      <w:proofErr w:type="spellEnd"/>
-      <w:r>
-        <w:rPr>
-          <w:sz w:val="26"/>
-          <w:szCs w:val="26"/>
-        </w:rPr>
-        <w:t xml:space="preserve"> </w:t>
-      </w:r>
-      <w:proofErr w:type="spellStart"/>
-      <w:r>
-        <w:rPr>
-          <w:sz w:val="26"/>
-          <w:szCs w:val="26"/>
-        </w:rPr>
-        <w:t>và</w:t>
-      </w:r>
-      <w:proofErr w:type="spellEnd"/>
-      <w:r>
-        <w:rPr>
-          <w:sz w:val="26"/>
-          <w:szCs w:val="26"/>
-        </w:rPr>
-        <w:t xml:space="preserve"> </w:t>
-      </w:r>
-      <w:proofErr w:type="spellStart"/>
-      <w:r>
-        <w:rPr>
-          <w:sz w:val="26"/>
-          <w:szCs w:val="26"/>
-        </w:rPr>
-        <w:t>các</w:t>
-      </w:r>
-      <w:proofErr w:type="spellEnd"/>
-      <w:r>
-        <w:rPr>
-          <w:sz w:val="26"/>
-          <w:szCs w:val="26"/>
-        </w:rPr>
-        <w:t xml:space="preserve"> </w:t>
-      </w:r>
-      <w:proofErr w:type="spellStart"/>
-      <w:r>
-        <w:rPr>
-          <w:sz w:val="26"/>
-          <w:szCs w:val="26"/>
-        </w:rPr>
-        <w:t>chế</w:t>
-      </w:r>
-      <w:proofErr w:type="spellEnd"/>
-      <w:r>
-        <w:rPr>
-          <w:sz w:val="26"/>
-          <w:szCs w:val="26"/>
-        </w:rPr>
-        <w:t xml:space="preserve"> </w:t>
-      </w:r>
-      <w:proofErr w:type="spellStart"/>
-      <w:r>
-        <w:rPr>
-          <w:sz w:val="26"/>
-          <w:szCs w:val="26"/>
-        </w:rPr>
-        <w:t>độ</w:t>
-      </w:r>
-      <w:proofErr w:type="spellEnd"/>
-      <w:r>
-        <w:rPr>
-          <w:sz w:val="26"/>
-          <w:szCs w:val="26"/>
-        </w:rPr>
-        <w:t xml:space="preserve"> </w:t>
-      </w:r>
-      <w:proofErr w:type="spellStart"/>
-      <w:r>
-        <w:rPr>
-          <w:sz w:val="26"/>
-          <w:szCs w:val="26"/>
-        </w:rPr>
-        <w:t>tiếp</w:t>
-      </w:r>
-      <w:proofErr w:type="spellEnd"/>
-      <w:r>
-        <w:rPr>
-          <w:sz w:val="26"/>
-          <w:szCs w:val="26"/>
-        </w:rPr>
-        <w:t xml:space="preserve"> </w:t>
-      </w:r>
-      <w:proofErr w:type="spellStart"/>
-      <w:r>
-        <w:rPr>
-          <w:sz w:val="26"/>
-          <w:szCs w:val="26"/>
-        </w:rPr>
-        <w:t>theo</w:t>
-      </w:r>
-      <w:proofErr w:type="spellEnd"/>
-      <w:r>
-        <w:rPr>
-          <w:sz w:val="26"/>
-          <w:szCs w:val="26"/>
-        </w:rPr>
-        <w:t>:</w:t>
-      </w:r>
-    </w:p>
-    <w:p>
-      <w:pPr>
-        <w:spacing w:before="120" w:after="280" w:afterAutospacing="1"/>
-        <w:rPr>
-          <w:sz w:val="26"/>
-          <w:szCs w:val="26"/>
-        </w:rPr>
-      </w:pPr>
+      <w:r>
+        <w:rPr>
+          <w:sz w:val="26"/>
+          <w:szCs w:val="26"/>
+          <w:u w:val="single"/>
+        </w:rPr>
+        <w:t xml:space="preserve"> </w:t>
+      </w:r>
       <w:r>
         <w:rPr>
           <w:sz w:val="26"/>
@@ -4340,12 +4528,12 @@
 </file>
 
 <file path=word/styles.xml><?xml version="1.0" encoding="utf-8"?>
-<w:styles xmlns:mc="http://schemas.openxmlformats.org/markup-compatibility/2006" xmlns:r="http://schemas.openxmlformats.org/officeDocument/2006/relationships" xmlns:w="http://schemas.openxmlformats.org/wordprocessingml/2006/main" xmlns:w14="http://schemas.microsoft.com/office/word/2010/wordml" xmlns:w15="http://schemas.microsoft.com/office/word/2012/wordml" xmlns:w16cex="http://schemas.microsoft.com/office/word/2018/wordml/cex" xmlns:w16cid="http://schemas.microsoft.com/office/word/2016/wordml/cid" xmlns:w16="http://schemas.microsoft.com/office/word/2018/wordml" xmlns:w16sdtdh="http://schemas.microsoft.com/office/word/2020/wordml/sdtdatahash" xmlns:w16se="http://schemas.microsoft.com/office/word/2015/wordml/symex" mc:Ignorable="w14 w15 w16se w16cid w16 w16cex w16sdtdh">
+<w:styles xmlns:mc="http://schemas.openxmlformats.org/markup-compatibility/2006" xmlns:r="http://schemas.openxmlformats.org/officeDocument/2006/relationships" xmlns:w="http://schemas.openxmlformats.org/wordprocessingml/2006/main" xmlns:w14="http://schemas.microsoft.com/office/word/2010/wordml" xmlns:w15="http://schemas.microsoft.com/office/word/2012/wordml" xmlns:w16cex="http://schemas.microsoft.com/office/word/2018/wordml/cex" xmlns:w16cid="http://schemas.microsoft.com/office/word/2016/wordml/cid" xmlns:w16="http://schemas.microsoft.com/office/word/2018/wordml" xmlns:w16sdtdh="http://schemas.microsoft.com/office/word/2020/wordml/sdtdatahash" xmlns:w16sdtfl="http://schemas.microsoft.com/office/word/2024/wordml/sdtformatlock" xmlns:w16se="http://schemas.microsoft.com/office/word/2015/wordml/symex" xmlns:w16du="http://schemas.microsoft.com/office/word/2023/wordml/word16du" mc:Ignorable="w14 w15 w16se w16cid w16 w16cex w16sdtdh w16sdtfl w16du">
   <w:docDefaults>
     <w:rPrDefault>
       <w:rPr>
         <w:rFonts w:ascii="Calibri" w:eastAsia="Calibri" w:hAnsi="Calibri" w:cs="Times New Roman"/>
-        <w:lang w:val="en-US" w:eastAsia="en-US" w:bidi="ar-SA"/>
+        <w:lang w:val="en-VN" w:eastAsia="en-US" w:bidi="ar-SA"/>
       </w:rPr>
     </w:rPrDefault>
     <w:pPrDefault/>
@@ -4736,6 +4924,7 @@
       <w:rFonts w:ascii="Times New Roman" w:eastAsia="Times New Roman" w:hAnsi="Times New Roman"/>
       <w:sz w:val="24"/>
       <w:szCs w:val="24"/>
+      <w:lang w:val="en-US"/>
     </w:rPr>
   </w:style>
   <w:style w:type="character" w:default="1" w:styleId="DefaultParagraphFont">

</xml_diff>